<commit_message>
docs(makale): risk skorlama ve senaryo bölümlerini güncel koşumla yenile
n=13.609 dropna düzeltmesi sonrası risk bölümü (Tablo 23, Şekil 16-20,
Bölüm 3.7/4.11 declustering, Sınırlılık) ve E-04 sonrası senaryo yeniden
koşumu (Özet/Abstract, Tablo 17/18/20, ~11 paragraf) docx'e işlendi.

Co-Authored-By: Claude Opus 4.8 (1M context) <noreply@anthropic.com>
</commit_message>
<xml_diff>
--- a/makale/QuakeMind_Makale_Taslak_2026-09-16_sekillieklendi_v3_LOCAL_2026-09-21.docx
+++ b/makale/QuakeMind_Makale_Taslak_2026-09-16_sekillieklendi_v3_LOCAL_2026-09-21.docx
@@ -143,7 +143,7 @@
         <w:rPr>
           <w:highlight w:val="yellow"/>
         </w:rPr>
-        <w:t xml:space="preserve">6 Şubat 2023 Kahramanmaraş depremlerinde yol ağı kapanmaları, arama-kurtarma ekiplerinin erişilebilirliğini belirleyen temel kısıtlardan biri olmuştur. Yazında hasar tespiti ile ekip sevki büyük ölçüde ayrı ele alınmakta; bölütleme başarımındaki bir değişimin operasyonel sonuca ne ölçüde yansıdığı nicel olarak gösterilmemektedir. Bu çalışmada, uydu görüntüsünden hasar bölütlemesi ve yol ağıyla piksel-düzeyi kesişim (SegFormer, MiT-B4 kodlayıcı; odaksal ve Dice kayıplarının bileşimi), yer seviyesi hasar tespiti (YOLOv8), Türkçe ihbar metni çözümlemesi (BERTurk ve varlık ismi tanıma) ile kapanma-farkında güzergâh planlamasını (A*, sert kapatma ve yakınlık tabanlı ağırlık cezası) tek bir sevk zincirinde bütünleştirmek üzere tasarlanan QuakeMind platformu sunulmaktadır. Değerlendirme, Hatay ve Kahramanmaraş'ta sekiz bölgede, bölge başına 6 afetzede-ekip çifti (toplam 48) içeren bir senaryo üzerinde, on rastgelelik tohumuyla yürütülmüştür. Kapanmalar iki kaynaktan alınmıştır: sekiz ilçede sentetik bir üreticiden ve Copernicus EMS EMSR648 kapsamındaki dört ilçede gerçek hasar derecelerinden (üç geçilebilirlik kuralı). Sentetik senaryoda kapanma-farkında planlama, kapanma bilgisi olmayan naif ajana göre görev başına ortalama müdahale süresini 189,6 ± 205,9 dakikadan 13,0 ± 8,3 dakikaya indirmiştir; ancak farkın %97,4'ü keşfedilen her kapanma için varsayılan 20 dakikalık yeniden yönlenme cezasından kaynaklanmaktadır. Görüş mesafeli ve bilgi paylaşan referanslara karşı bu farkın yakalanan payı sınırlı kalmaktadır (sırasıyla %2,8 ve %5,3). Gerçek hasarla (EMSR648) Kahramanmaraş'ta katı kuralda fark tam olarak sıfır, orta/gevşek kuralda 39,1 dakikadır. Bölütleme hatasının operasyonel etkisi, SegFormer kapanmalarıyla planlanıp EMSR648 kapanmalarında yürünen üç drone sahnesinde ölçülmüş ve olumsuz sonuç vermiştir: sert kullanımın 15 ayarının hiçbiri kapanma bilgisi olmayan ajandan daha kısa ulaşım süresi sağlamamıştır. Görev orkestrasyonunda her tohumda 48 atamanın 48'i tamamlanmış ve mükerrer sevk denemelerinin tamamı engellenmiştir. Çok mimarili karşılaştırma protokolü, yol hasarını piksel düzeyinde etiketleyen açık bir Türkiye kümesi bulunmadığından bina hasarı bölütlemesinde yürütülmüş; kıyaslama mimarileri arasında en yüksek hasar sınıfı kesişim/birleşim oranı (Intersection over Union, IoU) değeri LinkNet ile elde edilmiştir (0,3700). Türkçe metin sınıflandırmada sekiz model çok etiketli alt kategori kümesinde karşılaştırılmış; BERTurk mikro-F₁'de öne çıkarken (0,8247) klasik bir terim sıklığı–ters belge sıklığı (TF-IDF) taban çizgisi makro-F₁'de BERTurk'ü geçmiştir (0,5024 ve 0,4725). Çalışmanın </w:t>
+        <w:t xml:space="preserve">6 Şubat 2023 Kahramanmaraş depremlerinde yol ağı kapanmaları, arama-kurtarma ekiplerinin erişilebilirliğini belirleyen temel kısıtlardan biri olmuştur. Yazında hasar tespiti ile ekip sevki büyük ölçüde ayrı ele alınmakta; bölütleme başarımındaki bir değişimin operasyonel sonuca ne ölçüde yansıdığı nicel olarak gösterilmemektedir. Bu çalışmada, uydu görüntüsünden hasar bölütlemesi ve yol ağıyla piksel-düzeyi kesişim (SegFormer, MiT-B4 kodlayıcı; odaksal ve Dice kayıplarının bileşimi), yer seviyesi hasar tespiti (YOLOv8), Türkçe ihbar metni çözümlemesi (BERTurk ve varlık ismi tanıma) ile kapanma-farkında güzergâh planlamasını (A*, sert kapatma ve yakınlık tabanlı ağırlık cezası) tek bir sevk zincirinde bütünleştirmek üzere tasarlanan QuakeMind platformu sunulmaktadır. Değerlendirme, Hatay ve Kahramanmaraş'ta sekiz bölgede, bölge başına 6 afetzede-ekip çifti (toplam 48) içeren bir senaryo üzerinde, on rastgelelik tohumuyla yürütülmüştür. Kapanmalar iki kaynaktan alınmıştır: sekiz ilçede sentetik bir üreticiden ve Copernicus EMS EMSR648 kapsamındaki dört ilçede gerçek hasar derecelerinden (üç geçilebilirlik kuralı). Sentetik senaryoda kapanma-farkında planlama, kapanma bilgisi olmayan naif ajana göre görev başına ortalama müdahale süresini 184,9 ± 200,2 dakikadan 12,8 ± 8,3 dakikaya indirmiştir; ancak farkın %97,4'ü keşfedilen her kapanma için varsayılan 20 dakikalık yeniden yönlenme cezasından kaynaklanmaktadır. Görüş mesafeli ve bilgi paylaşan referanslara karşı bu farkın yakalanan payı sınırlı kalmaktadır (sırasıyla %2,3 ve %5,1). Gerçek hasarla (EMSR648) Kahramanmaraş'ta katı kuralda fark tam olarak sıfır, orta/gevşek kuralda 44,4 dakikadır. Bölütleme hatasının operasyonel etkisi, SegFormer kapanmalarıyla planlanıp EMSR648 kapanmalarında yürünen üç drone sahnesinde ölçülmüş ve olumsuz sonuç vermiştir: sert kullanımın 15 ayarının hiçbiri kapanma bilgisi olmayan ajandan daha kısa ulaşım süresi sağlamamıştır. Görev orkestrasyonunda her tohumda 48 atamanın 48'i tamamlanmış ve mükerrer sevk denemelerinin tamamı engellenmiştir. Çok mimarili karşılaştırma protokolü, yol hasarını piksel düzeyinde etiketleyen açık bir Türkiye kümesi bulunmadığından bina hasarı bölütlemesinde yürütülmüş; kıyaslama mimarileri arasında en yüksek hasar sınıfı kesişim/birleşim oranı (Intersection over Union, IoU) değeri LinkNet ile elde edilmiştir (0,3700). Türkçe metin sınıflandırmada sekiz model çok etiketli alt kategori kümesinde karşılaştırılmış; BERTurk mikro-F₁'de öne çıkarken (0,8247) klasik bir terim sıklığı–ters belge sıklığı (TF-IDF) taban çizgisi makro-F₁'de BERTurk'ü geçmiştir (0,5024 ve 0,4725). Çalışmanın </w:t>
       </w:r>
       <w:r>
         <w:rPr>
@@ -196,7 +196,7 @@
         <w:rPr>
           <w:highlight w:val="yellow"/>
         </w:rPr>
-        <w:t>During the 6 February 2023 Kahramanmaraş earthquakes, road network blockages were among the decisive constraints on the accessibility of search-and-rescue teams. In the literature, damage detection and team dispatch are largely treated in isolation, and the extent to which a change in segmentation performance propagates to the operational outcome is not quantified. This study presents QuakeMind, a platform designed to integrate satellite-imagery damage segmentation intersected pixel-wise with the road network (SegFormer with a MiT-B4 encoder; combined focal and Dice loss), ground-level damage detection (YOLOv8), Turkish report-text analysis (BERTurk and named entity recognition), and blockage-aware route planning (A* with hard edge removal and proximity-based edge penalties) into a single dispatch chain. The evaluation was conducted on a scenario in Hatay and Kahramanmaraş comprising eight districts with 6 affected-individual/team pairs each (48 in total), repeated with ten random seeds. Blockages were taken from two sources: a synthetic generator in all eight districts, and real damage grades from Copernicus EMS EMSR648 in the four districts it covers (three passability rules). In the synthetic scenario, blockage-aware planning reduced the mean per-task response time relative to a naive agent without blockage information from 189.6 ± 205.9 to 13.0 ± 8.3 minutes; however, 97.4% of the difference stems from an assumed 20-minute re-routing penalty per discovered blockage. Against line-of-sight and information-sharing references, the share of this gap captured is limited (2.8% and 5.3%, respectively). With real damage (EMSR648), the difference is exactly zero under the strict rule in Kahramanmaraş (no destroyed segments) and 39.1 minutes under the medium/loose rules. The operational effect of segmentation errors was measured in three drone scenes by planning with SegFormer blockages and walking in the EMSR648 world, and the result was negative: none of the 15 hard-closure settings yielded shorter travel times than the agent without blockage information. In every seed, all 48 assignments were completed and all duplicate dispatch attempts were blocked. Because no open Turkish dataset annotates road damage at the pixel level, the multi-architecture comparison protocol was applied to building damage segmentation; among the comparison architectures, the highest damage-class Intersection over Union (IoU) was obtained by LinkNet (0.3700). For Turkish text classification, eight models were compared on a multi-label subcategory set; BERTurk led on micro-F₁ (0.8247), while a classical TF-IDF baseline surpassed it on macro-F₁ (0.5024 versus 0.4725). The contribution is the definition and application of a reproducible task-based evaluation protocol linking segmentation quality to operational outcome, and the explicit demonstration that current segmentation performance does not yet produce a gain in this chain.</w:t>
+        <w:t>During the 6 February 2023 Kahramanmaraş earthquakes, road network blockages were among the decisive constraints on the accessibility of search-and-rescue teams. In the literature, damage detection and team dispatch are largely treated in isolation, and the extent to which a change in segmentation performance propagates to the operational outcome is not quantified. This study presents QuakeMind, a platform designed to integrate satellite-imagery damage segmentation intersected pixel-wise with the road network (SegFormer with a MiT-B4 encoder; combined focal and Dice loss), ground-level damage detection (YOLOv8), Turkish report-text analysis (BERTurk and named entity recognition), and blockage-aware route planning (A* with hard edge removal and proximity-based edge penalties) into a single dispatch chain. The evaluation was conducted on a scenario in Hatay and Kahramanmaraş comprising eight districts with 6 affected-individual/team pairs each (48 in total), repeated with ten random seeds. Blockages were taken from two sources: a synthetic generator in all eight districts, and real damage grades from Copernicus EMS EMSR648 in the four districts it covers (three passability rules). In the synthetic scenario, blockage-aware planning reduced the mean per-task response time relative to a naive agent without blockage information from 184.9 ± 200.2 to 12.8 ± 8.3 minutes; however, 97.4% of the difference stems from an assumed 20-minute re-routing penalty per discovered blockage. Against line-of-sight and information-sharing references, the share of this gap captured is limited (2.3% and 5.1%, respectively). With real damage (EMSR648), the difference is exactly zero under the strict rule in Kahramanmaraş (no destroyed segments) and 44.4 minutes under the medium/loose rules. The operational effect of segmentation errors was measured in three drone scenes by planning with SegFormer blockages and walking in the EMSR648 world, and the result was negative: none of the 15 hard-closure settings yielded shorter travel times than the agent without blockage information. In every seed, all 48 assignments were completed and all duplicate dispatch attempts were blocked. Because no open Turkish dataset annotates road damage at the pixel level, the multi-architecture comparison protocol was applied to building damage segmentation; among the comparison architectures, the highest damage-class Intersection over Union (IoU) was obtained by LinkNet (0.3700). For Turkish text classification, eight models were compared on a multi-label subcategory set; BERTurk led on micro-F₁ (0.8247), while a classical TF-IDF baseline surpassed it on macro-F₁ (0.5024 versus 0.4725). The contribution is the definition and application of a reproducible task-based evaluation protocol linking segmentation quality to operational outcome, and the explicit demonstration that current segmentation performance does not yet produce a gain in this chain.</w:t>
       </w:r>
     </w:p>
     <w:p>
@@ -5592,7 +5592,7 @@
     </w:p>
     <w:p>
       <w:r>
-        <w:t xml:space="preserve">Bölüm 2.1'de belirtildiği üzere, Türkiye kaynaklı ve yol ağı hasarını piksel düzeyinde etiketleyen açık bir veri kümesi yazında bulunmamaktadır. Bina hasarı için aynı depremleri kapsayan açık kümeler mevcut olduğundan (KATE-CD [56], MEDBFS [57]), Bölüm 3.4'teki çok mimarili karşılaştırma bu sürümde bina hasarı görevinde yürütülmüş ve sonuçları Bölüm 4.2'de raporlanmıştır. Karşılaştırmanın yol hasarına uygulanabilmesi için gereken eğitim kümesi ise bu çalışma kapsamında oluşturulacaktır. Kümenin künyesi </w:t>
+        <w:t xml:space="preserve">Bölüm 2.1'de belirtildiği üzere, Türkiye kaynaklı ve yol ağı hasarını piksel düzeyinde etiketleyen açık bir veri kümesi yazında bulunmamaktadır. Bina hasarı için aynı depremleri kapsayan açık kümeler mevcut olduğundan (KATE-CD [56], MEDBFS [57]), Bölüm 3.4'teki çok mimarili karşılaştırma bu sürümde bina hasarı görevinde yürütülmüş ve sonuçları Bölüm 4.2'de raporlanmıştır. Karşılaştırmanın yol hasarına uygulanabilmesi için gereken piksel-etiketli eğitim kümesi bu sürümde oluşturulmamıştır ve gelecek çalışma kapsamına bırakılmıştır (bkz. Sınırlılık (m), (r)). Kümenin künyesi </w:t>
       </w:r>
       <w:r>
         <w:t xml:space="preserve">Tablo </w:t>
@@ -10139,7 +10139,7 @@
         <w:rPr>
           <w:b/>
         </w:rPr>
-        <w:t>İkinci aşama — sınıflandırma. BERTurk [32] tabanlı bir metin sınıflandırıcı, ihbarı 13 alt kategoriden bir veya birden fazlasına atar: sigmoid çıkışlı çok etiketli bir kurguda her alt kategori için karar eşiği 0,50'dir. Alt kategoriler, sevk mantığının kullandığı beş üst kategoriye eşlenir (Tablo 9). En yüksek skorlu etiketin güveni 0,30'un altındaysa kayıt, gerçek sınıfından bağımsız olarak doğrudan "Alakasız" kategorisine atanır; bu durumda coğrafi kodlama ve varlık ismi tanıma adımları çalıştırılmaz ve kayıt sevk zincirine aktarılmaz. Dolayısıyla düşük güvenli kayıtlar, operatör onayına sunulan ayrı bir "belirsiz" kuyruğuna değil, doğrudan ve geri döndürülemez bir elemeye tabi tutulur; sevk durumu modelinde bu iki durum (gerçek Alakasız sınıfı ile düşük güven nedeniyle elenen kayıtlar) ayırt edilmeden aynı kategoride temsil edilir. Bu tasarımın sonuçları Bölüm 4.5 ve Bölüm 5.3(c)'de tartışılmaktadır.</w:t>
+        <w:t>İkinci aşama — sınıflandırma. BERTurk [32] tabanlı bir metin sınıflandırıcı, ihbarı 13 alt kategoriden bir veya birden fazlasına atar: sigmoid çıkışlı çok etiketli bir kurguda her alt kategori için karar eşiği 0,50'dir. Alt kategoriler, sevk mantığının kullandığı beş üst kategoriye eşlenir (Tablo 9). En yüksek skorlu etiketin güveni 0,30'un altındaysa ve kayıt beş üst kategorinin hiçbirine ait anahtar sözcük kanıtı taşımıyorsa, kayıt gerçek sınıfından bağımsız olarak "Belirsiz" kategorisine atanır; bu durumda coğrafi kodlama ve varlık ismi tanıma adımları yine çalıştırılır ve kayıt düşük aciliyet düzeyiyle sevk zincirine aktarılır. Dolayısıyla düşük güvenli kayıtlar artık doğrudan ve geri döndürülemez biçimde elenmemekte; sevk durumu modelinde "Belirsiz" kategorisi, modelin yüksek güvenle ilgisiz bulduğu "Alakasız" sınıfından ayrık biçimde temsil edilmektedir. Bu tasarımın sonuçları Bölüm 4.5 ve Bölüm 5.3(c)'de tartışılmaktadır.</w:t>
       </w:r>
     </w:p>
     <w:p>
@@ -11125,7 +11125,7 @@
     </w:p>
     <w:p>
       <w:r>
-        <w:t xml:space="preserve">Katalog verisi üzerinde kümelenmeden arındırma (declustering) bu sürümde uygulanmamıştır; bu sınırlılığın olası etkisi Bölüm 4.11'de tartışılmaktadır. Katalogdaki her kayıt için diri fay hattına en kısa mesafe, geçmiş sismisite yoğunluğu ve derinlik dağılımı öznitelik olarak hesaplanır. Pozitif sınıf resmî olarak şöyle tanımlanır: katalogdaki i. kayıt için, kayıt zamanından itibaren 30 gün içinde ve kaydın konumundan 100 km yarıçap içinde büyüklüğü M ≥ 4,0 olan başka bir olay gerçekleşiyorsa y_i = 1, aksi hâlde y_i = 0'dır; analiz birimi bir uzamsal ızgara hücresi değil, katalogdaki bireysel deprem kaydıdır (bkz. Bölüm 4.11, n = 454). Sınıflandırıcı olarak CatBoost [48] kullanılmıştır (800 yineleme, </w:t>
+        <w:t xml:space="preserve">Katalog verisi üzerinde kümelenmeden arındırma (declustering) uygulanmıştır (1 gün / 50 km sabit pencereli basit bir yöntem); bu yöntemin sınırlılığı Bölüm 4.11'de tartışılmaktadır. Katalogdaki her kayıt için diri fay hattına en kısa mesafe, geçmiş sismisite yoğunluğu ve derinlik dağılımı öznitelik olarak hesaplanır. Pozitif sınıf resmî olarak şöyle tanımlanır: katalogdaki i. kayıt için, kayıt zamanından itibaren 30 gün içinde ve kaydın konumundan 100 km yarıçap içinde büyüklüğü M ≥ 4,0 olan başka bir olay gerçekleşiyorsa y_i = 1, aksi hâlde y_i = 0'dır; analiz birimi bir uzamsal ızgara hücresi değil, katalogdaki bireysel deprem kaydıdır (bkz. Bölüm 4.11, n = 13 609). Sınıflandırıcı olarak CatBoost [48] kullanılmıştır (800 yineleme, </w:t>
       </w:r>
       <w:r>
         <w:lastRenderedPageBreak/>
@@ -12746,7 +12746,7 @@
         <w:rPr>
           <w:highlight w:val="yellow"/>
         </w:rPr>
-        <w:t>Dört referansın tamamı aynı oturumda, aynı kapanma kümesi ve aynı atamalarla koşulmuştur (Bölüm 4.6). R0, R1 ve R2 aynı simülatörle yürütülmüş; simülatörün R0 kipi, naif ajanın önceki hesabını 986 görevin tamamında birebir yeniden üretmiştir. Ek olarak R1 ile R2'nin birleşimi (R1 + R2), görüşü ve bilgi paylaşımını birlikte kullanan en güçlü referans olarak koşulmuştur.</w:t>
+        <w:t>Dört referansın tamamı aynı oturumda, aynı kapanma kümesi ve aynı atamalarla koşulmuştur (Bölüm 4.6). R0, R1 ve R2 aynı simülatörle yürütülmüş; simülatörün R0 kipi, naif ajanın önceki hesabını on tohum boyunca havuzlanan 1 146 görevin (R0 ve R3'ün ikisinin de ulaşılabilir olduğu görev-tohum-kaynak birleşimleri) tamamında birebir yeniden üretmiştir. Ek olarak R1 ile R2'nin birleşimi (R1 + R2), görüşü ve bilgi paylaşımını birlikte kullanan en güçlü referans olarak koşulmuştur.</w:t>
       </w:r>
     </w:p>
     <w:p>
@@ -16901,7 +16901,7 @@
         <w:fldChar w:fldCharType="end"/>
       </w:r>
       <w:r>
-        <w:t>'te künyesi verilecek kümenin oluşturulmasından sonra yapılacak ve sonuçlar ayrı bir tabloda raporlanacaktır.</w:t>
+        <w:t>'te künyesi tanımlanan kümenin bu sürümde oluşturulmamış olması nedeniyle gelecek çalışma kapsamına bırakılmıştır.</w:t>
       </w:r>
     </w:p>
     <w:p>
@@ -22699,17 +22699,17 @@
           </w:tcPr>
           <w:p>
             <w:r>
-              <w:t>430-433/480</w:t>
-            </w:r>
-          </w:p>
-        </w:tc>
-        <w:tc>
-          <w:tcPr>
-            <w:tcW w:w="0" w:type="auto"/>
-          </w:tcPr>
-          <w:p>
-            <w:r>
-              <w:t>~103-106/120</w:t>
+              <w:t>430-432/480</w:t>
+            </w:r>
+          </w:p>
+        </w:tc>
+        <w:tc>
+          <w:tcPr>
+            <w:tcW w:w="0" w:type="auto"/>
+          </w:tcPr>
+          <w:p>
+            <w:r>
+              <w:t>~103-105/120</w:t>
             </w:r>
           </w:p>
         </w:tc>
@@ -22764,47 +22764,47 @@
           </w:tcPr>
           <w:p>
             <w:r>
-              <w:t>13,0 ± 8,3</w:t>
-            </w:r>
-          </w:p>
-        </w:tc>
-        <w:tc>
-          <w:tcPr>
-            <w:tcW w:w="0" w:type="auto"/>
-          </w:tcPr>
-          <w:p>
-            <w:r>
-              <w:t>14,3 ± 7,4</w:t>
-            </w:r>
-          </w:p>
-        </w:tc>
-        <w:tc>
-          <w:tcPr>
-            <w:tcW w:w="0" w:type="auto"/>
-          </w:tcPr>
-          <w:p>
-            <w:r>
-              <w:t>11,6 ± 6,1</w:t>
-            </w:r>
-          </w:p>
-        </w:tc>
-        <w:tc>
-          <w:tcPr>
-            <w:tcW w:w="0" w:type="auto"/>
-          </w:tcPr>
-          <w:p>
-            <w:r>
-              <w:t>11,9 ± 6,3</w:t>
-            </w:r>
-          </w:p>
-        </w:tc>
-        <w:tc>
-          <w:tcPr>
-            <w:tcW w:w="0" w:type="auto"/>
-          </w:tcPr>
-          <w:p>
-            <w:r>
-              <w:t>11,9 ± 6,3</w:t>
+              <w:t>12,8 ± 8,3</w:t>
+            </w:r>
+          </w:p>
+        </w:tc>
+        <w:tc>
+          <w:tcPr>
+            <w:tcW w:w="0" w:type="auto"/>
+          </w:tcPr>
+          <w:p>
+            <w:r>
+              <w:t>14,2 ± 7,3</w:t>
+            </w:r>
+          </w:p>
+        </w:tc>
+        <w:tc>
+          <w:tcPr>
+            <w:tcW w:w="0" w:type="auto"/>
+          </w:tcPr>
+          <w:p>
+            <w:r>
+              <w:t>11,7 ± 5,9</w:t>
+            </w:r>
+          </w:p>
+        </w:tc>
+        <w:tc>
+          <w:tcPr>
+            <w:tcW w:w="0" w:type="auto"/>
+          </w:tcPr>
+          <w:p>
+            <w:r>
+              <w:t>12,0 ± 6,0</w:t>
+            </w:r>
+          </w:p>
+        </w:tc>
+        <w:tc>
+          <w:tcPr>
+            <w:tcW w:w="0" w:type="auto"/>
+          </w:tcPr>
+          <w:p>
+            <w:r>
+              <w:t>12,0 ± 6,0</w:t>
             </w:r>
           </w:p>
         </w:tc>
@@ -22829,47 +22829,47 @@
           </w:tcPr>
           <w:p>
             <w:r>
-              <w:t>189,6 ± 205,9</w:t>
-            </w:r>
-          </w:p>
-        </w:tc>
-        <w:tc>
-          <w:tcPr>
-            <w:tcW w:w="0" w:type="auto"/>
-          </w:tcPr>
-          <w:p>
-            <w:r>
-              <w:t>342,6 ± 262,8</w:t>
-            </w:r>
-          </w:p>
-        </w:tc>
-        <w:tc>
-          <w:tcPr>
-            <w:tcW w:w="0" w:type="auto"/>
-          </w:tcPr>
-          <w:p>
-            <w:r>
-              <w:t>18,9 ± 34,0</w:t>
-            </w:r>
-          </w:p>
-        </w:tc>
-        <w:tc>
-          <w:tcPr>
-            <w:tcW w:w="0" w:type="auto"/>
-          </w:tcPr>
-          <w:p>
-            <w:r>
-              <w:t>90,8 ± 159,5</w:t>
-            </w:r>
-          </w:p>
-        </w:tc>
-        <w:tc>
-          <w:tcPr>
-            <w:tcW w:w="0" w:type="auto"/>
-          </w:tcPr>
-          <w:p>
-            <w:r>
-              <w:t>90,8 ± 159,5</w:t>
+              <w:t>184,9 ± 200,2</w:t>
+            </w:r>
+          </w:p>
+        </w:tc>
+        <w:tc>
+          <w:tcPr>
+            <w:tcW w:w="0" w:type="auto"/>
+          </w:tcPr>
+          <w:p>
+            <w:r>
+              <w:t>331,8 ± 245,3</w:t>
+            </w:r>
+          </w:p>
+        </w:tc>
+        <w:tc>
+          <w:tcPr>
+            <w:tcW w:w="0" w:type="auto"/>
+          </w:tcPr>
+          <w:p>
+            <w:r>
+              <w:t>19,2 ± 34,4</w:t>
+            </w:r>
+          </w:p>
+        </w:tc>
+        <w:tc>
+          <w:tcPr>
+            <w:tcW w:w="0" w:type="auto"/>
+          </w:tcPr>
+          <w:p>
+            <w:r>
+              <w:t>76,1 ± 135,3</w:t>
+            </w:r>
+          </w:p>
+        </w:tc>
+        <w:tc>
+          <w:tcPr>
+            <w:tcW w:w="0" w:type="auto"/>
+          </w:tcPr>
+          <w:p>
+            <w:r>
+              <w:t>76,1 ± 135,3</w:t>
             </w:r>
           </w:p>
         </w:tc>
@@ -22894,17 +22894,17 @@
           </w:tcPr>
           <w:p>
             <w:r>
-              <w:t>184,7 ± 195,7</w:t>
-            </w:r>
-          </w:p>
-        </w:tc>
-        <w:tc>
-          <w:tcPr>
-            <w:tcW w:w="0" w:type="auto"/>
-          </w:tcPr>
-          <w:p>
-            <w:r>
-              <w:t>338,4 ± 247,4</w:t>
+              <w:t>180,9 ± 192,1</w:t>
+            </w:r>
+          </w:p>
+        </w:tc>
+        <w:tc>
+          <w:tcPr>
+            <w:tcW w:w="0" w:type="auto"/>
+          </w:tcPr>
+          <w:p>
+            <w:r>
+              <w:t>327,1 ± 233,9</w:t>
             </w:r>
           </w:p>
         </w:tc>
@@ -22959,17 +22959,17 @@
           </w:tcPr>
           <w:p>
             <w:r>
-              <w:t>180,2 ± 198,1</w:t>
-            </w:r>
-          </w:p>
-        </w:tc>
-        <w:tc>
-          <w:tcPr>
-            <w:tcW w:w="0" w:type="auto"/>
-          </w:tcPr>
-          <w:p>
-            <w:r>
-              <w:t>323,7 ± 251,1</w:t>
+              <w:t>176,1 ± 194,3</w:t>
+            </w:r>
+          </w:p>
+        </w:tc>
+        <w:tc>
+          <w:tcPr>
+            <w:tcW w:w="0" w:type="auto"/>
+          </w:tcPr>
+          <w:p>
+            <w:r>
+              <w:t>318,9 ± 233,8</w:t>
             </w:r>
           </w:p>
         </w:tc>
@@ -23089,47 +23089,47 @@
           </w:tcPr>
           <w:p>
             <w:r>
-              <w:t>176,6</w:t>
-            </w:r>
-          </w:p>
-        </w:tc>
-        <w:tc>
-          <w:tcPr>
-            <w:tcW w:w="0" w:type="auto"/>
-          </w:tcPr>
-          <w:p>
-            <w:r>
-              <w:t>328,3</w:t>
-            </w:r>
-          </w:p>
-        </w:tc>
-        <w:tc>
-          <w:tcPr>
-            <w:tcW w:w="0" w:type="auto"/>
-          </w:tcPr>
-          <w:p>
-            <w:r>
-              <w:t>7,3</w:t>
-            </w:r>
-          </w:p>
-        </w:tc>
-        <w:tc>
-          <w:tcPr>
-            <w:tcW w:w="0" w:type="auto"/>
-          </w:tcPr>
-          <w:p>
-            <w:r>
-              <w:t>78,9</w:t>
-            </w:r>
-          </w:p>
-        </w:tc>
-        <w:tc>
-          <w:tcPr>
-            <w:tcW w:w="0" w:type="auto"/>
-          </w:tcPr>
-          <w:p>
-            <w:r>
-              <w:t>78,9</w:t>
+              <w:t>172,1</w:t>
+            </w:r>
+          </w:p>
+        </w:tc>
+        <w:tc>
+          <w:tcPr>
+            <w:tcW w:w="0" w:type="auto"/>
+          </w:tcPr>
+          <w:p>
+            <w:r>
+              <w:t>317,6</w:t>
+            </w:r>
+          </w:p>
+        </w:tc>
+        <w:tc>
+          <w:tcPr>
+            <w:tcW w:w="0" w:type="auto"/>
+          </w:tcPr>
+          <w:p>
+            <w:r>
+              <w:t>7,5</w:t>
+            </w:r>
+          </w:p>
+        </w:tc>
+        <w:tc>
+          <w:tcPr>
+            <w:tcW w:w="0" w:type="auto"/>
+          </w:tcPr>
+          <w:p>
+            <w:r>
+              <w:t>64,1</w:t>
+            </w:r>
+          </w:p>
+        </w:tc>
+        <w:tc>
+          <w:tcPr>
+            <w:tcW w:w="0" w:type="auto"/>
+          </w:tcPr>
+          <w:p>
+            <w:r>
+              <w:t>64,1</w:t>
             </w:r>
           </w:p>
         </w:tc>
@@ -23229,37 +23229,37 @@
           </w:tcPr>
           <w:p>
             <w:r>
-              <w:t>95,8</w:t>
-            </w:r>
-          </w:p>
-        </w:tc>
-        <w:tc>
-          <w:tcPr>
-            <w:tcW w:w="0" w:type="auto"/>
-          </w:tcPr>
-          <w:p>
-            <w:r>
-              <w:t>38,6</w:t>
-            </w:r>
-          </w:p>
-        </w:tc>
-        <w:tc>
-          <w:tcPr>
-            <w:tcW w:w="0" w:type="auto"/>
-          </w:tcPr>
-          <w:p>
-            <w:r>
-              <w:t>86,9</w:t>
-            </w:r>
-          </w:p>
-        </w:tc>
-        <w:tc>
-          <w:tcPr>
-            <w:tcW w:w="0" w:type="auto"/>
-          </w:tcPr>
-          <w:p>
-            <w:r>
-              <w:t>86,9</w:t>
+              <w:t>95,7</w:t>
+            </w:r>
+          </w:p>
+        </w:tc>
+        <w:tc>
+          <w:tcPr>
+            <w:tcW w:w="0" w:type="auto"/>
+          </w:tcPr>
+          <w:p>
+            <w:r>
+              <w:t>39,1</w:t>
+            </w:r>
+          </w:p>
+        </w:tc>
+        <w:tc>
+          <w:tcPr>
+            <w:tcW w:w="0" w:type="auto"/>
+          </w:tcPr>
+          <w:p>
+            <w:r>
+              <w:t>84,2</w:t>
+            </w:r>
+          </w:p>
+        </w:tc>
+        <w:tc>
+          <w:tcPr>
+            <w:tcW w:w="0" w:type="auto"/>
+          </w:tcPr>
+          <w:p>
+            <w:r>
+              <w:t>84,2</w:t>
             </w:r>
           </w:p>
         </w:tc>
@@ -23284,17 +23284,17 @@
           </w:tcPr>
           <w:p>
             <w:r>
-              <w:t>93,0</w:t>
-            </w:r>
-          </w:p>
-        </w:tc>
-        <w:tc>
-          <w:tcPr>
-            <w:tcW w:w="0" w:type="auto"/>
-          </w:tcPr>
-          <w:p>
-            <w:r>
-              <w:t>95,8</w:t>
+              <w:t>92,9</w:t>
+            </w:r>
+          </w:p>
+        </w:tc>
+        <w:tc>
+          <w:tcPr>
+            <w:tcW w:w="0" w:type="auto"/>
+          </w:tcPr>
+          <w:p>
+            <w:r>
+              <w:t>95,7</w:t>
             </w:r>
           </w:p>
         </w:tc>
@@ -23349,17 +23349,17 @@
           </w:tcPr>
           <w:p>
             <w:r>
-              <w:t>92,8</w:t>
-            </w:r>
-          </w:p>
-        </w:tc>
-        <w:tc>
-          <w:tcPr>
-            <w:tcW w:w="0" w:type="auto"/>
-          </w:tcPr>
-          <w:p>
-            <w:r>
-              <w:t>95,6</w:t>
+              <w:t>92,7</w:t>
+            </w:r>
+          </w:p>
+        </w:tc>
+        <w:tc>
+          <w:tcPr>
+            <w:tcW w:w="0" w:type="auto"/>
+          </w:tcPr>
+          <w:p>
+            <w:r>
+              <w:t>95,5</w:t>
             </w:r>
           </w:p>
         </w:tc>
@@ -23479,17 +23479,17 @@
           </w:tcPr>
           <w:p>
             <w:r>
-              <w:t>2,8 / 5,3</w:t>
-            </w:r>
-          </w:p>
-        </w:tc>
-        <w:tc>
-          <w:tcPr>
-            <w:tcW w:w="0" w:type="auto"/>
-          </w:tcPr>
-          <w:p>
-            <w:r>
-              <w:t>1,3 / 5,8</w:t>
+              <w:t>2,3 / 5,1</w:t>
+            </w:r>
+          </w:p>
+        </w:tc>
+        <w:tc>
+          <w:tcPr>
+            <w:tcW w:w="0" w:type="auto"/>
+          </w:tcPr>
+          <w:p>
+            <w:r>
+              <w:t>1,5 / 4,1</w:t>
             </w:r>
           </w:p>
         </w:tc>
@@ -23544,7 +23544,7 @@
           </w:tcPr>
           <w:p>
             <w:r>
-              <w:t>4,7</w:t>
+              <w:t>4,4</w:t>
             </w:r>
           </w:p>
         </w:tc>
@@ -23574,17 +23574,17 @@
           </w:tcPr>
           <w:p>
             <w:r>
-              <w:t>3,0</w:t>
-            </w:r>
-          </w:p>
-        </w:tc>
-        <w:tc>
-          <w:tcPr>
-            <w:tcW w:w="0" w:type="auto"/>
-          </w:tcPr>
-          <w:p>
-            <w:r>
-              <w:t>3,0</w:t>
+              <w:t>2,4</w:t>
+            </w:r>
+          </w:p>
+        </w:tc>
+        <w:tc>
+          <w:tcPr>
+            <w:tcW w:w="0" w:type="auto"/>
+          </w:tcPr>
+          <w:p>
+            <w:r>
+              <w:t>2,4</w:t>
             </w:r>
           </w:p>
         </w:tc>
@@ -23674,47 +23674,47 @@
           </w:tcPr>
           <w:p>
             <w:r>
-              <w:t>8,60</w:t>
-            </w:r>
-          </w:p>
-        </w:tc>
-        <w:tc>
-          <w:tcPr>
-            <w:tcW w:w="0" w:type="auto"/>
-          </w:tcPr>
-          <w:p>
-            <w:r>
-              <w:t>16,03</w:t>
-            </w:r>
-          </w:p>
-        </w:tc>
-        <w:tc>
-          <w:tcPr>
-            <w:tcW w:w="0" w:type="auto"/>
-          </w:tcPr>
-          <w:p>
-            <w:r>
-              <w:t>0,36</w:t>
-            </w:r>
-          </w:p>
-        </w:tc>
-        <w:tc>
-          <w:tcPr>
-            <w:tcW w:w="0" w:type="auto"/>
-          </w:tcPr>
-          <w:p>
-            <w:r>
-              <w:t>3,80</w:t>
-            </w:r>
-          </w:p>
-        </w:tc>
-        <w:tc>
-          <w:tcPr>
-            <w:tcW w:w="0" w:type="auto"/>
-          </w:tcPr>
-          <w:p>
-            <w:r>
-              <w:t>3,80</w:t>
+              <w:t>8,38</w:t>
+            </w:r>
+          </w:p>
+        </w:tc>
+        <w:tc>
+          <w:tcPr>
+            <w:tcW w:w="0" w:type="auto"/>
+          </w:tcPr>
+          <w:p>
+            <w:r>
+              <w:t>15,52</w:t>
+            </w:r>
+          </w:p>
+        </w:tc>
+        <w:tc>
+          <w:tcPr>
+            <w:tcW w:w="0" w:type="auto"/>
+          </w:tcPr>
+          <w:p>
+            <w:r>
+              <w:t>0,37</w:t>
+            </w:r>
+          </w:p>
+        </w:tc>
+        <w:tc>
+          <w:tcPr>
+            <w:tcW w:w="0" w:type="auto"/>
+          </w:tcPr>
+          <w:p>
+            <w:r>
+              <w:t>3,08</w:t>
+            </w:r>
+          </w:p>
+        </w:tc>
+        <w:tc>
+          <w:tcPr>
+            <w:tcW w:w="0" w:type="auto"/>
+          </w:tcPr>
+          <w:p>
+            <w:r>
+              <w:t>3,08</w:t>
             </w:r>
           </w:p>
         </w:tc>
@@ -23759,27 +23759,27 @@
           </w:tcPr>
           <w:p>
             <w:r>
-              <w:t>98,6</w:t>
-            </w:r>
-          </w:p>
-        </w:tc>
-        <w:tc>
-          <w:tcPr>
-            <w:tcW w:w="0" w:type="auto"/>
-          </w:tcPr>
-          <w:p>
-            <w:r>
-              <w:t>96,2</w:t>
-            </w:r>
-          </w:p>
-        </w:tc>
-        <w:tc>
-          <w:tcPr>
-            <w:tcW w:w="0" w:type="auto"/>
-          </w:tcPr>
-          <w:p>
-            <w:r>
-              <w:t>96,2</w:t>
+              <w:t>98,7</w:t>
+            </w:r>
+          </w:p>
+        </w:tc>
+        <w:tc>
+          <w:tcPr>
+            <w:tcW w:w="0" w:type="auto"/>
+          </w:tcPr>
+          <w:p>
+            <w:r>
+              <w:t>96,3</w:t>
+            </w:r>
+          </w:p>
+        </w:tc>
+        <w:tc>
+          <w:tcPr>
+            <w:tcW w:w="0" w:type="auto"/>
+          </w:tcPr>
+          <w:p>
+            <w:r>
+              <w:t>96,3</w:t>
             </w:r>
           </w:p>
         </w:tc>
@@ -23804,47 +23804,47 @@
           </w:tcPr>
           <w:p>
             <w:r>
-              <w:t>88,1</w:t>
-            </w:r>
-          </w:p>
-        </w:tc>
-        <w:tc>
-          <w:tcPr>
-            <w:tcW w:w="0" w:type="auto"/>
-          </w:tcPr>
-          <w:p>
-            <w:r>
-              <w:t>96,1</w:t>
-            </w:r>
-          </w:p>
-        </w:tc>
-        <w:tc>
-          <w:tcPr>
-            <w:tcW w:w="0" w:type="auto"/>
-          </w:tcPr>
-          <w:p>
-            <w:r>
-              <w:t>7,5</w:t>
-            </w:r>
-          </w:p>
-        </w:tc>
-        <w:tc>
-          <w:tcPr>
-            <w:tcW w:w="0" w:type="auto"/>
-          </w:tcPr>
-          <w:p>
-            <w:r>
-              <w:t>35,6</w:t>
-            </w:r>
-          </w:p>
-        </w:tc>
-        <w:tc>
-          <w:tcPr>
-            <w:tcW w:w="0" w:type="auto"/>
-          </w:tcPr>
-          <w:p>
-            <w:r>
-              <w:t>35,6</w:t>
+              <w:t>89,3</w:t>
+            </w:r>
+          </w:p>
+        </w:tc>
+        <w:tc>
+          <w:tcPr>
+            <w:tcW w:w="0" w:type="auto"/>
+          </w:tcPr>
+          <w:p>
+            <w:r>
+              <w:t>97,1</w:t>
+            </w:r>
+          </w:p>
+        </w:tc>
+        <w:tc>
+          <w:tcPr>
+            <w:tcW w:w="0" w:type="auto"/>
+          </w:tcPr>
+          <w:p>
+            <w:r>
+              <w:t>6,7</w:t>
+            </w:r>
+          </w:p>
+        </w:tc>
+        <w:tc>
+          <w:tcPr>
+            <w:tcW w:w="0" w:type="auto"/>
+          </w:tcPr>
+          <w:p>
+            <w:r>
+              <w:t>33,1</w:t>
+            </w:r>
+          </w:p>
+        </w:tc>
+        <w:tc>
+          <w:tcPr>
+            <w:tcW w:w="0" w:type="auto"/>
+          </w:tcPr>
+          <w:p>
+            <w:r>
+              <w:t>33,1</w:t>
             </w:r>
           </w:p>
         </w:tc>
@@ -23939,7 +23939,7 @@
         <w:rPr>
           <w:highlight w:val="yellow"/>
         </w:rPr>
-        <w:t xml:space="preserve"> ceza teriminin toplamıdır. Sekiz bölgelik sentetik blokta görev başına ortalama 176,6 dakikalık farkın %97,4'ü ceza teriminden kaynaklanmaktadır (</w:t>
+        <w:t xml:space="preserve"> ceza teriminin toplamıdır. Sekiz bölgelik sentetik blokta görev başına ortalama 172,1 dakikalık farkın %97,4'ü ceza teriminden kaynaklanmaktadır (</w:t>
       </w:r>
       <w:r>
         <w:rPr>
@@ -23952,7 +23952,7 @@
         <w:rPr>
           <w:highlight w:val="yellow"/>
         </w:rPr>
-        <w:t xml:space="preserve"> = 8,60 ortalama keşif olayı, </w:t>
+        <w:t xml:space="preserve"> = 8,38 ortalama keşif olayı, </w:t>
       </w:r>
       <w:r>
         <w:rPr>
@@ -23965,7 +23965,7 @@
         <w:rPr>
           <w:highlight w:val="yellow"/>
         </w:rPr>
-        <w:t xml:space="preserve"> = 20 dk); parametreden bağımsız bileşen görev başına ortalama 4,6 dakikadır. Dolayısıyla yüksek görünen bir kazanç oranı tek başına savunulamaz: kapanma farkındalığının parametreden bağımsız katkısı, naif ajanın kat ettiği yol bakımından sentetik blokta %26,6 düzeyindedir. </w:t>
+        <w:t xml:space="preserve"> = 20 dk); parametreden bağımsız bileşen görev başına ortalama 4,4 dakikadır. Dolayısıyla yüksek görünen bir kazanç oranı tek başına savunulamaz: kapanma farkındalığının parametreden bağımsız katkısı, naif ajanın kat ettiği yol bakımından sentetik blokta %25,6 düzeyindedir. </w:t>
       </w:r>
       <w:r>
         <w:rPr>
@@ -24077,7 +24077,7 @@
         <w:rPr>
           <w:highlight w:val="yellow"/>
         </w:rPr>
-        <w:t>, R0'ın bir üst sınır olduğunu daha güçlü referanslarla sınamaktadır. Sentetik blokta önerilen sistemin (R3) sağladığı toplam kazancın R1 tarafından yakalanan payı yalnızca %2,8, R2 tarafından yakalanan payı %5,3'tür — yani bu yeniden inşa edilen gerçek yol ağında R1 ve R2 sınırlı bir iyileşme sağlamaktadır. Bunun başlıca nedeni kavşaklar arası tipik kenar uzunluğunun R1'in 100 m'lik görüş mesafesine yakın ya da ondan uzun olması, dolayısıyla R1'in çoğu durumda kapanmayı R0 ile aynı noktada (kavşağa vardığında) öğrenmesidir. R2'nin katkısı da benzer şekilde sınırlıdır: bilgi paylaşımı yalnızca aynı bölgede ardışık yola çıkan ekipler arasında işlemekte, ilk keşfeden ekip yine kendi maliyetini ödemektedir. Bu bulgular, önceki (kayıp) simülatörün rapor ettiği %80-85 düzeyindeki paylarla ÇELİŞMEKTEDİR;</w:t>
+        <w:t>, R0'ın bir üst sınır olduğunu daha güçlü referanslarla sınamaktadır. Sentetik blokta önerilen sistemin (R3) sağladığı toplam kazancın R1 tarafından yakalanan payı yalnızca %2,3, R2 tarafından yakalanan payı %5,1'dir — yani bu yeniden inşa edilen gerçek yol ağında R1 ve R2 sınırlı bir iyileşme sağlamaktadır. Bunun başlıca nedeni kavşaklar arası tipik kenar uzunluğunun R1'in 100 m'lik görüş mesafesine yakın ya da ondan uzun olması, dolayısıyla R1'in çoğu durumda kapanmayı R0 ile aynı noktada (kavşağa vardığında) öğrenmesidir. R2'nin katkısı da benzer şekilde sınırlıdır: bilgi paylaşımı yalnızca aynı bölgede ardışık yola çıkan ekipler arasında işlemekte, ilk keşfeden ekip yine kendi maliyetini ödemektedir. Bu bulgular, önceki (kayıp) simülatörün rapor ettiği %80-85 düzeyindeki paylarla ÇELİŞMEKTEDİR;</w:t>
       </w:r>
       <w:r>
         <w:rPr>
@@ -24114,7 +24114,7 @@
         <w:rPr>
           <w:highlight w:val="yellow"/>
         </w:rPr>
-        <w:t xml:space="preserve"> R1'in R0'a üstünlüğü bu yeniden inşa edilen ağda sınırlıdır (yalnızca %2,8'lik bir kazanç payı yakalanmaktadır); Bölüm 4.6'da açıklandığı üzere bunun başlıca nedeni kavşaklar arası tipik kenar uzunluğunun R1'in 100 m'lik görüş mesafesine yakın ya da ondan uzun olmasıdır. R2'nin katkısı da sınırlıdır (%5,3): bilgi paylaşımı yalnızca aynı bölgede ardışık yola çıkan ekipler arasında işlemekte, ilk keşfeden ekip yine kendi maliyetini ödemektedir. Bilgi paylaşımı her zaman süreyi kısaltmaz: bilinmeyen yolu açık sayan bir ekip, telsizle erken yön d</w:t>
+        <w:t xml:space="preserve"> R1'in R0'a üstünlüğü bu yeniden inşa edilen ağda sınırlıdır (yalnızca %2,3'lük bir kazanç payı yakalanmaktadır); Bölüm 4.6'da açıklandığı üzere bunun başlıca nedeni kavşaklar arası tipik kenar uzunluğunun R1'in 100 m'lik görüş mesafesine yakın ya da ondan uzun olmasıdır. R2'nin katkısı da sınırlıdır (%5,1): bilgi paylaşımı yalnızca aynı bölgede ardışık yola çıkan ekipler arasında işlemekte, ilk keşfeden ekip yine kendi maliyetini ödemektedir. Bilgi paylaşımı her zaman süreyi kısaltmaz: bilinmeyen yolu açık sayan bir ekip, telsizle erken yön d</w:t>
       </w:r>
       <w:r>
         <w:rPr>
@@ -24359,57 +24359,57 @@
           </w:tcPr>
           <w:p>
             <w:r>
-              <w:t>17,7</w:t>
-            </w:r>
-          </w:p>
-        </w:tc>
-        <w:tc>
-          <w:tcPr>
-            <w:tcW w:w="0" w:type="auto"/>
-          </w:tcPr>
-          <w:p>
-            <w:r>
-              <w:t>4,7</w:t>
-            </w:r>
-          </w:p>
-        </w:tc>
-        <w:tc>
-          <w:tcPr>
-            <w:tcW w:w="0" w:type="auto"/>
-          </w:tcPr>
-          <w:p>
-            <w:r>
-              <w:t>26,6</w:t>
-            </w:r>
-          </w:p>
-        </w:tc>
-        <w:tc>
-          <w:tcPr>
-            <w:tcW w:w="0" w:type="auto"/>
-          </w:tcPr>
-          <w:p>
-            <w:r>
-              <w:t>0,9</w:t>
-            </w:r>
-          </w:p>
-        </w:tc>
-        <w:tc>
-          <w:tcPr>
-            <w:tcW w:w="0" w:type="auto"/>
-          </w:tcPr>
-          <w:p>
-            <w:r>
-              <w:t>20,1</w:t>
-            </w:r>
-          </w:p>
-        </w:tc>
-        <w:tc>
-          <w:tcPr>
-            <w:tcW w:w="0" w:type="auto"/>
-          </w:tcPr>
-          <w:p>
-            <w:r>
-              <w:t>20,1</w:t>
+              <w:t>17,2</w:t>
+            </w:r>
+          </w:p>
+        </w:tc>
+        <w:tc>
+          <w:tcPr>
+            <w:tcW w:w="0" w:type="auto"/>
+          </w:tcPr>
+          <w:p>
+            <w:r>
+              <w:t>4,4</w:t>
+            </w:r>
+          </w:p>
+        </w:tc>
+        <w:tc>
+          <w:tcPr>
+            <w:tcW w:w="0" w:type="auto"/>
+          </w:tcPr>
+          <w:p>
+            <w:r>
+              <w:t>25,6</w:t>
+            </w:r>
+          </w:p>
+        </w:tc>
+        <w:tc>
+          <w:tcPr>
+            <w:tcW w:w="0" w:type="auto"/>
+          </w:tcPr>
+          <w:p>
+            <w:r>
+              <w:t>1,1</w:t>
+            </w:r>
+          </w:p>
+        </w:tc>
+        <w:tc>
+          <w:tcPr>
+            <w:tcW w:w="0" w:type="auto"/>
+          </w:tcPr>
+          <w:p>
+            <w:r>
+              <w:t>16,7</w:t>
+            </w:r>
+          </w:p>
+        </w:tc>
+        <w:tc>
+          <w:tcPr>
+            <w:tcW w:w="0" w:type="auto"/>
+          </w:tcPr>
+          <w:p>
+            <w:r>
+              <w:t>16,7</w:t>
             </w:r>
           </w:p>
         </w:tc>
@@ -24434,57 +24434,57 @@
           </w:tcPr>
           <w:p>
             <w:r>
-              <w:t>34,9</w:t>
-            </w:r>
-          </w:p>
-        </w:tc>
-        <w:tc>
-          <w:tcPr>
-            <w:tcW w:w="0" w:type="auto"/>
-          </w:tcPr>
-          <w:p>
-            <w:r>
-              <w:t>21,9</w:t>
-            </w:r>
-          </w:p>
-        </w:tc>
-        <w:tc>
-          <w:tcPr>
-            <w:tcW w:w="0" w:type="auto"/>
-          </w:tcPr>
-          <w:p>
-            <w:r>
-              <w:t>62,8</w:t>
-            </w:r>
-          </w:p>
-        </w:tc>
-        <w:tc>
-          <w:tcPr>
-            <w:tcW w:w="0" w:type="auto"/>
-          </w:tcPr>
-          <w:p>
-            <w:r>
-              <w:t>6,5</w:t>
-            </w:r>
-          </w:p>
-        </w:tc>
-        <w:tc>
-          <w:tcPr>
-            <w:tcW w:w="0" w:type="auto"/>
-          </w:tcPr>
-          <w:p>
-            <w:r>
-              <w:t>47,1</w:t>
-            </w:r>
-          </w:p>
-        </w:tc>
-        <w:tc>
-          <w:tcPr>
-            <w:tcW w:w="0" w:type="auto"/>
-          </w:tcPr>
-          <w:p>
-            <w:r>
-              <w:t>47,1</w:t>
+              <w:t>34,0</w:t>
+            </w:r>
+          </w:p>
+        </w:tc>
+        <w:tc>
+          <w:tcPr>
+            <w:tcW w:w="0" w:type="auto"/>
+          </w:tcPr>
+          <w:p>
+            <w:r>
+              <w:t>21,2</w:t>
+            </w:r>
+          </w:p>
+        </w:tc>
+        <w:tc>
+          <w:tcPr>
+            <w:tcW w:w="0" w:type="auto"/>
+          </w:tcPr>
+          <w:p>
+            <w:r>
+              <w:t>62,3</w:t>
+            </w:r>
+          </w:p>
+        </w:tc>
+        <w:tc>
+          <w:tcPr>
+            <w:tcW w:w="0" w:type="auto"/>
+          </w:tcPr>
+          <w:p>
+            <w:r>
+              <w:t>6,9</w:t>
+            </w:r>
+          </w:p>
+        </w:tc>
+        <w:tc>
+          <w:tcPr>
+            <w:tcW w:w="0" w:type="auto"/>
+          </w:tcPr>
+          <w:p>
+            <w:r>
+              <w:t>41,7</w:t>
+            </w:r>
+          </w:p>
+        </w:tc>
+        <w:tc>
+          <w:tcPr>
+            <w:tcW w:w="0" w:type="auto"/>
+          </w:tcPr>
+          <w:p>
+            <w:r>
+              <w:t>41,7</w:t>
             </w:r>
           </w:p>
         </w:tc>
@@ -24509,57 +24509,57 @@
           </w:tcPr>
           <w:p>
             <w:r>
-              <w:t>60,6</w:t>
-            </w:r>
-          </w:p>
-        </w:tc>
-        <w:tc>
-          <w:tcPr>
-            <w:tcW w:w="0" w:type="auto"/>
-          </w:tcPr>
-          <w:p>
-            <w:r>
-              <w:t>47,6</w:t>
-            </w:r>
-          </w:p>
-        </w:tc>
-        <w:tc>
-          <w:tcPr>
-            <w:tcW w:w="0" w:type="auto"/>
-          </w:tcPr>
-          <w:p>
-            <w:r>
-              <w:t>78,5</w:t>
-            </w:r>
-          </w:p>
-        </w:tc>
-        <w:tc>
-          <w:tcPr>
-            <w:tcW w:w="0" w:type="auto"/>
-          </w:tcPr>
-          <w:p>
-            <w:r>
-              <w:t>14,1</w:t>
-            </w:r>
-          </w:p>
-        </w:tc>
-        <w:tc>
-          <w:tcPr>
-            <w:tcW w:w="0" w:type="auto"/>
-          </w:tcPr>
-          <w:p>
-            <w:r>
-              <w:t>64,9</w:t>
-            </w:r>
-          </w:p>
-        </w:tc>
-        <w:tc>
-          <w:tcPr>
-            <w:tcW w:w="0" w:type="auto"/>
-          </w:tcPr>
-          <w:p>
-            <w:r>
-              <w:t>64,9</w:t>
+              <w:t>59,2</w:t>
+            </w:r>
+          </w:p>
+        </w:tc>
+        <w:tc>
+          <w:tcPr>
+            <w:tcW w:w="0" w:type="auto"/>
+          </w:tcPr>
+          <w:p>
+            <w:r>
+              <w:t>46,4</w:t>
+            </w:r>
+          </w:p>
+        </w:tc>
+        <w:tc>
+          <w:tcPr>
+            <w:tcW w:w="0" w:type="auto"/>
+          </w:tcPr>
+          <w:p>
+            <w:r>
+              <w:t>78,3</w:t>
+            </w:r>
+          </w:p>
+        </w:tc>
+        <w:tc>
+          <w:tcPr>
+            <w:tcW w:w="0" w:type="auto"/>
+          </w:tcPr>
+          <w:p>
+            <w:r>
+              <w:t>14,4</w:t>
+            </w:r>
+          </w:p>
+        </w:tc>
+        <w:tc>
+          <w:tcPr>
+            <w:tcW w:w="0" w:type="auto"/>
+          </w:tcPr>
+          <w:p>
+            <w:r>
+              <w:t>59,8</w:t>
+            </w:r>
+          </w:p>
+        </w:tc>
+        <w:tc>
+          <w:tcPr>
+            <w:tcW w:w="0" w:type="auto"/>
+          </w:tcPr>
+          <w:p>
+            <w:r>
+              <w:t>59,8</w:t>
             </w:r>
           </w:p>
         </w:tc>
@@ -24584,57 +24584,57 @@
           </w:tcPr>
           <w:p>
             <w:r>
-              <w:t>103,6</w:t>
-            </w:r>
-          </w:p>
-        </w:tc>
-        <w:tc>
-          <w:tcPr>
-            <w:tcW w:w="0" w:type="auto"/>
-          </w:tcPr>
-          <w:p>
-            <w:r>
-              <w:t>90,6</w:t>
-            </w:r>
-          </w:p>
-        </w:tc>
-        <w:tc>
-          <w:tcPr>
-            <w:tcW w:w="0" w:type="auto"/>
-          </w:tcPr>
-          <w:p>
-            <w:r>
-              <w:t>87,4</w:t>
-            </w:r>
-          </w:p>
-        </w:tc>
-        <w:tc>
-          <w:tcPr>
-            <w:tcW w:w="0" w:type="auto"/>
-          </w:tcPr>
-          <w:p>
-            <w:r>
-              <w:t>24,2</w:t>
-            </w:r>
-          </w:p>
-        </w:tc>
-        <w:tc>
-          <w:tcPr>
-            <w:tcW w:w="0" w:type="auto"/>
-          </w:tcPr>
-          <w:p>
-            <w:r>
-              <w:t>77,5</w:t>
-            </w:r>
-          </w:p>
-        </w:tc>
-        <w:tc>
-          <w:tcPr>
-            <w:tcW w:w="0" w:type="auto"/>
-          </w:tcPr>
-          <w:p>
-            <w:r>
-              <w:t>77,5</w:t>
+              <w:t>101,1</w:t>
+            </w:r>
+          </w:p>
+        </w:tc>
+        <w:tc>
+          <w:tcPr>
+            <w:tcW w:w="0" w:type="auto"/>
+          </w:tcPr>
+          <w:p>
+            <w:r>
+              <w:t>88,3</w:t>
+            </w:r>
+          </w:p>
+        </w:tc>
+        <w:tc>
+          <w:tcPr>
+            <w:tcW w:w="0" w:type="auto"/>
+          </w:tcPr>
+          <w:p>
+            <w:r>
+              <w:t>87,3</w:t>
+            </w:r>
+          </w:p>
+        </w:tc>
+        <w:tc>
+          <w:tcPr>
+            <w:tcW w:w="0" w:type="auto"/>
+          </w:tcPr>
+          <w:p>
+            <w:r>
+              <w:t>24,5</w:t>
+            </w:r>
+          </w:p>
+        </w:tc>
+        <w:tc>
+          <w:tcPr>
+            <w:tcW w:w="0" w:type="auto"/>
+          </w:tcPr>
+          <w:p>
+            <w:r>
+              <w:t>73,5</w:t>
+            </w:r>
+          </w:p>
+        </w:tc>
+        <w:tc>
+          <w:tcPr>
+            <w:tcW w:w="0" w:type="auto"/>
+          </w:tcPr>
+          <w:p>
+            <w:r>
+              <w:t>73,5</w:t>
             </w:r>
           </w:p>
         </w:tc>
@@ -24659,17 +24659,17 @@
           </w:tcPr>
           <w:p>
             <w:r>
-              <w:t>189,6</w:t>
-            </w:r>
-          </w:p>
-        </w:tc>
-        <w:tc>
-          <w:tcPr>
-            <w:tcW w:w="0" w:type="auto"/>
-          </w:tcPr>
-          <w:p>
-            <w:r>
-              <w:t>176,6</w:t>
+              <w:t>184,9</w:t>
+            </w:r>
+          </w:p>
+        </w:tc>
+        <w:tc>
+          <w:tcPr>
+            <w:tcW w:w="0" w:type="auto"/>
+          </w:tcPr>
+          <w:p>
+            <w:r>
+              <w:t>172,1</w:t>
             </w:r>
           </w:p>
         </w:tc>
@@ -24689,27 +24689,27 @@
           </w:tcPr>
           <w:p>
             <w:r>
-              <w:t>38,6</w:t>
-            </w:r>
-          </w:p>
-        </w:tc>
-        <w:tc>
-          <w:tcPr>
-            <w:tcW w:w="0" w:type="auto"/>
-          </w:tcPr>
-          <w:p>
-            <w:r>
-              <w:t>86,9</w:t>
-            </w:r>
-          </w:p>
-        </w:tc>
-        <w:tc>
-          <w:tcPr>
-            <w:tcW w:w="0" w:type="auto"/>
-          </w:tcPr>
-          <w:p>
-            <w:r>
-              <w:t>86,9</w:t>
+              <w:t>39,0</w:t>
+            </w:r>
+          </w:p>
+        </w:tc>
+        <w:tc>
+          <w:tcPr>
+            <w:tcW w:w="0" w:type="auto"/>
+          </w:tcPr>
+          <w:p>
+            <w:r>
+              <w:t>84,2</w:t>
+            </w:r>
+          </w:p>
+        </w:tc>
+        <w:tc>
+          <w:tcPr>
+            <w:tcW w:w="0" w:type="auto"/>
+          </w:tcPr>
+          <w:p>
+            <w:r>
+              <w:t>84,2</w:t>
             </w:r>
           </w:p>
         </w:tc>
@@ -24734,57 +24734,57 @@
           </w:tcPr>
           <w:p>
             <w:r>
-              <w:t>275,6</w:t>
-            </w:r>
-          </w:p>
-        </w:tc>
-        <w:tc>
-          <w:tcPr>
-            <w:tcW w:w="0" w:type="auto"/>
-          </w:tcPr>
-          <w:p>
-            <w:r>
-              <w:t>262,6</w:t>
-            </w:r>
-          </w:p>
-        </w:tc>
-        <w:tc>
-          <w:tcPr>
-            <w:tcW w:w="0" w:type="auto"/>
-          </w:tcPr>
-          <w:p>
-            <w:r>
-              <w:t>95,3</w:t>
-            </w:r>
-          </w:p>
-        </w:tc>
-        <w:tc>
-          <w:tcPr>
-            <w:tcW w:w="0" w:type="auto"/>
-          </w:tcPr>
-          <w:p>
-            <w:r>
-              <w:t>48,4</w:t>
-            </w:r>
-          </w:p>
-        </w:tc>
-        <w:tc>
-          <w:tcPr>
-            <w:tcW w:w="0" w:type="auto"/>
-          </w:tcPr>
-          <w:p>
-            <w:r>
-              <w:t>90,8</w:t>
-            </w:r>
-          </w:p>
-        </w:tc>
-        <w:tc>
-          <w:tcPr>
-            <w:tcW w:w="0" w:type="auto"/>
-          </w:tcPr>
-          <w:p>
-            <w:r>
-              <w:t>90,8</w:t>
+              <w:t>268,8</w:t>
+            </w:r>
+          </w:p>
+        </w:tc>
+        <w:tc>
+          <w:tcPr>
+            <w:tcW w:w="0" w:type="auto"/>
+          </w:tcPr>
+          <w:p>
+            <w:r>
+              <w:t>255,9</w:t>
+            </w:r>
+          </w:p>
+        </w:tc>
+        <w:tc>
+          <w:tcPr>
+            <w:tcW w:w="0" w:type="auto"/>
+          </w:tcPr>
+          <w:p>
+            <w:r>
+              <w:t>95,2</w:t>
+            </w:r>
+          </w:p>
+        </w:tc>
+        <w:tc>
+          <w:tcPr>
+            <w:tcW w:w="0" w:type="auto"/>
+          </w:tcPr>
+          <w:p>
+            <w:r>
+              <w:t>48,8</w:t>
+            </w:r>
+          </w:p>
+        </w:tc>
+        <w:tc>
+          <w:tcPr>
+            <w:tcW w:w="0" w:type="auto"/>
+          </w:tcPr>
+          <w:p>
+            <w:r>
+              <w:t>88,8</w:t>
+            </w:r>
+          </w:p>
+        </w:tc>
+        <w:tc>
+          <w:tcPr>
+            <w:tcW w:w="0" w:type="auto"/>
+          </w:tcPr>
+          <w:p>
+            <w:r>
+              <w:t>88,8</w:t>
             </w:r>
           </w:p>
         </w:tc>
@@ -24880,7 +24880,7 @@
         <w:rPr>
           <w:highlight w:val="yellow"/>
         </w:rPr>
-        <w:t xml:space="preserve"> = 0) sentetik blokta naif ajanın kat ettiği yolun %26,6'sı düzeyindedir. </w:t>
+        <w:t xml:space="preserve"> = 0) sentetik blokta naif ajanın kat ettiği yolun %25,6'sı düzeyindedir. </w:t>
       </w:r>
       <w:r>
         <w:rPr>
@@ -24906,7 +24906,7 @@
         <w:rPr>
           <w:highlight w:val="yellow"/>
         </w:rPr>
-        <w:t>=0'da 17,7 dk, =5'te 60,6 dk, =10'da 103,6 dk, =20'de 189,6 dk, =30'da 275,6 dk (R3 bu parametreden bağımsızdır; k=0 olduğundan sabit ~13,0 dk). Bu beş değer yeniden simülasyon gerektirmeden, aynı ham (mesafe, keşif sayısı) verisinden türetilmiştir.</w:t>
+        <w:t>=0'da 17,2 dk, =5'te 59,2 dk, =10'da 101,1 dk, =20'de 184,9 dk, =30'da 268,8 dk (R3 bu parametreden bağımsızdır; k=0 olduğundan sabit ~12,8 dk). Bu beş değer yeniden simülasyon gerektirmeden, aynı ham (mesafe, keşif sayısı) verisinden türetilmiştir.</w:t>
       </w:r>
     </w:p>
     <w:p>
@@ -24921,7 +24921,7 @@
         <w:rPr>
           <w:highlight w:val="yellow"/>
         </w:rPr>
-        <w:t xml:space="preserve"> Toplam fark görevler ve bölgeler arasında eşit dağılmamaktadır: bölge ölçeği çok farklıdır (K-Z1'in 24 970 kenarlık grafı ile H-Z5'in 2 858 kenarlık grafı arasında yaklaşık dokuz kat fark vardır, Tablo 10), bu da mutlak süre farklarının bölgeden bölgeye büyük ölçüde değişmesine yol açmaktadır. EMSR648 bloğunda katı kuralla Kahramanmaraş'ta (K-Z1 + K-Z2) hiçbir kenar kapanmadığından fark tam olarak sıfırdır; orta ve gevşek kurallarda ise aynı bölgelerde belirgin bir fark ortaya çıkmaktadır (53,4 dk; Bölüm 4.8). Bu yeniden inşada görev düzeyinde medyan/çeyrek dağılımı veya bölgesel keşif-yoğunlaşması ayrıca hesaplanmamıştır; önceki sürümde bu düzeyde raporlanan (ör. %79 görev, medyan 60,3 dk, tek görevde 38 keşif gibi) ayrıntılar bir simülatör koduyla doğrulanamadığından bu sürümde üretilmemiş ve kaldırılmıştır.</w:t>
+        <w:t xml:space="preserve"> Toplam fark görevler ve bölgeler arasında eşit dağılmamaktadır: bölge ölçeği çok farklıdır (K-Z1'in 24 970 kenarlık grafı ile H-Z5'in 2 858 kenarlık grafı arasında yaklaşık dokuz kat fark vardır, Tablo 10), bu da mutlak süre farklarının bölgeden bölgeye büyük ölçüde değişmesine yol açmaktadır. EMSR648 bloğunda katı kuralla Kahramanmaraş'ta (K-Z1 + K-Z2) hiçbir kenar kapanmadığından fark tam olarak sıfırdır; orta ve gevşek kurallarda ise aynı bölgelerde belirgin bir fark ortaya çıkmaktadır (44,4 dk; Bölüm 4.8). Bu yeniden inşada görev düzeyinde medyan/çeyrek dağılımı veya bölgesel keşif-yoğunlaşması ayrıca hesaplanmamıştır; önceki sürümde bu düzeyde raporlanan (ör. %79 görev, medyan 60,3 dk, tek görevde 38 keşif gibi) ayrıntılar bir simülatör koduyla doğrulanamadığından bu sürümde üretilmemiş ve kaldırılmıştır.</w:t>
       </w:r>
     </w:p>
     <w:p>
@@ -25190,7 +25190,7 @@
         <w:rPr>
           <w:highlight w:val="yellow"/>
         </w:rPr>
-        <w:t xml:space="preserve">Görev düzeyinde işaretli sıra testi raporlanmamıştır. Naif ajan yalnızca açık kenarlarda yürüdüğünden izlediği yol, kapanmaları bilen en kısa yoldan kısa olamaz; bu çalışmadaki tüm senaryo yapılandırmalarında on tohum boyunca havuzlanan 986 görevin hiçbirinde yol farkı negatif değildir. Bu koşulda işaretli sıra testi yapı gereği anlamlı çıkmakta ve etki büyüklüğü </w:t>
+        <w:t xml:space="preserve">Görev düzeyinde işaretli sıra testi raporlanmamıştır. Naif ajan yalnızca açık kenarlarda yürüdüğünden izlediği yol, kapanmaları bilen en kısa yoldan kısa olamaz; bu çalışmadaki tüm senaryo yapılandırmalarında on tohum boyunca havuzlanan 1 146 görevin hiçbirinde yol farkı negatif değildir. Bu koşulda işaretli sıra testi yapı gereği anlamlı çıkmakta ve etki büyüklüğü </w:t>
       </w:r>
       <w:r>
         <w:rPr>
@@ -29532,27 +29532,27 @@
           </w:tcPr>
           <w:p>
             <w:r>
-              <w:t>10,6 ± 6,3</w:t>
-            </w:r>
-          </w:p>
-        </w:tc>
-        <w:tc>
-          <w:tcPr>
-            <w:tcW w:w="0" w:type="auto"/>
-          </w:tcPr>
-          <w:p>
-            <w:r>
-              <w:t>25,2 ± 47,0</w:t>
-            </w:r>
-          </w:p>
-        </w:tc>
-        <w:tc>
-          <w:tcPr>
-            <w:tcW w:w="0" w:type="auto"/>
-          </w:tcPr>
-          <w:p>
-            <w:r>
-              <w:t>0,72</w:t>
+              <w:t>10,8 ± 6,1</w:t>
+            </w:r>
+          </w:p>
+        </w:tc>
+        <w:tc>
+          <w:tcPr>
+            <w:tcW w:w="0" w:type="auto"/>
+          </w:tcPr>
+          <w:p>
+            <w:r>
+              <w:t>25,7 ± 47,4</w:t>
+            </w:r>
+          </w:p>
+        </w:tc>
+        <w:tc>
+          <w:tcPr>
+            <w:tcW w:w="0" w:type="auto"/>
+          </w:tcPr>
+          <w:p>
+            <w:r>
+              <w:t>0,73</w:t>
             </w:r>
           </w:p>
         </w:tc>
@@ -29627,17 +29627,17 @@
           </w:tcPr>
           <w:p>
             <w:r>
-              <w:t>12,6 ± 5,8</w:t>
-            </w:r>
-          </w:p>
-        </w:tc>
-        <w:tc>
-          <w:tcPr>
-            <w:tcW w:w="0" w:type="auto"/>
-          </w:tcPr>
-          <w:p>
-            <w:r>
-              <w:t>12,6 ± 5,8</w:t>
+              <w:t>12,6 ± 5,6</w:t>
+            </w:r>
+          </w:p>
+        </w:tc>
+        <w:tc>
+          <w:tcPr>
+            <w:tcW w:w="0" w:type="auto"/>
+          </w:tcPr>
+          <w:p>
+            <w:r>
+              <w:t>12,6 ± 5,6</w:t>
             </w:r>
           </w:p>
         </w:tc>
@@ -29722,27 +29722,27 @@
           </w:tcPr>
           <w:p>
             <w:r>
-              <w:t>10,8 ± 6,3</w:t>
-            </w:r>
-          </w:p>
-        </w:tc>
-        <w:tc>
-          <w:tcPr>
-            <w:tcW w:w="0" w:type="auto"/>
-          </w:tcPr>
-          <w:p>
-            <w:r>
-              <w:t>61,0 ± 122,8</w:t>
-            </w:r>
-          </w:p>
-        </w:tc>
-        <w:tc>
-          <w:tcPr>
-            <w:tcW w:w="0" w:type="auto"/>
-          </w:tcPr>
-          <w:p>
-            <w:r>
-              <w:t>2,45</w:t>
+              <w:t>11,0 ± 6,1</w:t>
+            </w:r>
+          </w:p>
+        </w:tc>
+        <w:tc>
+          <w:tcPr>
+            <w:tcW w:w="0" w:type="auto"/>
+          </w:tcPr>
+          <w:p>
+            <w:r>
+              <w:t>49,8 ± 95,7</w:t>
+            </w:r>
+          </w:p>
+        </w:tc>
+        <w:tc>
+          <w:tcPr>
+            <w:tcW w:w="0" w:type="auto"/>
+          </w:tcPr>
+          <w:p>
+            <w:r>
+              <w:t>1,90</w:t>
             </w:r>
           </w:p>
         </w:tc>
@@ -29817,27 +29817,27 @@
           </w:tcPr>
           <w:p>
             <w:r>
-              <w:t>13,0 ± 6,1</w:t>
-            </w:r>
-          </w:p>
-        </w:tc>
-        <w:tc>
-          <w:tcPr>
-            <w:tcW w:w="0" w:type="auto"/>
-          </w:tcPr>
-          <w:p>
-            <w:r>
-              <w:t>121,7 ± 185,2</w:t>
-            </w:r>
-          </w:p>
-        </w:tc>
-        <w:tc>
-          <w:tcPr>
-            <w:tcW w:w="0" w:type="auto"/>
-          </w:tcPr>
-          <w:p>
-            <w:r>
-              <w:t>5,19</w:t>
+              <w:t>13,0 ± 5,9</w:t>
+            </w:r>
+          </w:p>
+        </w:tc>
+        <w:tc>
+          <w:tcPr>
+            <w:tcW w:w="0" w:type="auto"/>
+          </w:tcPr>
+          <w:p>
+            <w:r>
+              <w:t>103,3 ± 162,3</w:t>
+            </w:r>
+          </w:p>
+        </w:tc>
+        <w:tc>
+          <w:tcPr>
+            <w:tcW w:w="0" w:type="auto"/>
+          </w:tcPr>
+          <w:p>
+            <w:r>
+              <w:t>4,31</w:t>
             </w:r>
           </w:p>
         </w:tc>
@@ -29912,27 +29912,27 @@
           </w:tcPr>
           <w:p>
             <w:r>
-              <w:t>10,8 ± 6,3</w:t>
-            </w:r>
-          </w:p>
-        </w:tc>
-        <w:tc>
-          <w:tcPr>
-            <w:tcW w:w="0" w:type="auto"/>
-          </w:tcPr>
-          <w:p>
-            <w:r>
-              <w:t>61,0 ± 122,8</w:t>
-            </w:r>
-          </w:p>
-        </w:tc>
-        <w:tc>
-          <w:tcPr>
-            <w:tcW w:w="0" w:type="auto"/>
-          </w:tcPr>
-          <w:p>
-            <w:r>
-              <w:t>2,45</w:t>
+              <w:t>11,0 ± 6,1</w:t>
+            </w:r>
+          </w:p>
+        </w:tc>
+        <w:tc>
+          <w:tcPr>
+            <w:tcW w:w="0" w:type="auto"/>
+          </w:tcPr>
+          <w:p>
+            <w:r>
+              <w:t>49,8 ± 95,7</w:t>
+            </w:r>
+          </w:p>
+        </w:tc>
+        <w:tc>
+          <w:tcPr>
+            <w:tcW w:w="0" w:type="auto"/>
+          </w:tcPr>
+          <w:p>
+            <w:r>
+              <w:t>1,90</w:t>
             </w:r>
           </w:p>
         </w:tc>
@@ -30007,27 +30007,27 @@
           </w:tcPr>
           <w:p>
             <w:r>
-              <w:t>13,0 ± 6,1</w:t>
-            </w:r>
-          </w:p>
-        </w:tc>
-        <w:tc>
-          <w:tcPr>
-            <w:tcW w:w="0" w:type="auto"/>
-          </w:tcPr>
-          <w:p>
-            <w:r>
-              <w:t>121,7 ± 185,2</w:t>
-            </w:r>
-          </w:p>
-        </w:tc>
-        <w:tc>
-          <w:tcPr>
-            <w:tcW w:w="0" w:type="auto"/>
-          </w:tcPr>
-          <w:p>
-            <w:r>
-              <w:t>5,19</w:t>
+              <w:t>13,0 ± 5,9</w:t>
+            </w:r>
+          </w:p>
+        </w:tc>
+        <w:tc>
+          <w:tcPr>
+            <w:tcW w:w="0" w:type="auto"/>
+          </w:tcPr>
+          <w:p>
+            <w:r>
+              <w:t>103,3 ± 162,3</w:t>
+            </w:r>
+          </w:p>
+        </w:tc>
+        <w:tc>
+          <w:tcPr>
+            <w:tcW w:w="0" w:type="auto"/>
+          </w:tcPr>
+          <w:p>
+            <w:r>
+              <w:t>4,31</w:t>
             </w:r>
           </w:p>
         </w:tc>
@@ -30073,7 +30073,7 @@
         <w:rPr>
           <w:highlight w:val="yellow"/>
         </w:rPr>
-        <w:t>Kahramanmaraş'ta (K-Z1) katı kural altında hiçbir kenar kapanmamaktadır: bölge kutusundaki hasarlı kesimlerin hiçbiri Destroyed derecesinde değildir. Bu kuralda önerilen sistem ile R0 aynı güzergâhı izlemekte ve fark tam olarak sıfır olmaktadır (R0 = R3 = 11,3 dk). Aynı yer gerçeğinden orta/gevşek kuralla 406 kenar kapanmakta; R0'ın görev başına ortalama süresi 64,9 ± 141,4 dk'ya çıkarken önerilen sistemin süresi 11,5 ± 6,2 dk'da kalmaktadır (fark 53,4 dk). Hatay'da (H-Z1) katı kuralda 70 kenar kapanmakta, R0 ortalaması 17,3 dk, R3 10,0 dk (fark 7,3 dk); orta/gevşek kuralda 194 kenar kapanmakta, R0 35,1 dk, R3 10,0 dk (fark 25,1 dk) olmaktadır.</w:t>
+        <w:t>Kahramanmaraş'ta (K-Z1) katı kural altında hiçbir kenar kapanmamaktadır: bölge kutusundaki hasarlı kesimlerin hiçbiri Destroyed derecesinde değildir. Bu kuralda önerilen sistem ile R0 aynı güzergâhı izlemekte ve fark tam olarak sıfır olmaktadır (R0 = R3 = 12,6 dk). Aynı yer gerçeğinden orta/gevşek kuralla 406 kenar kapanmakta; R0'ın görev başına ortalama süresi 103,3 ± 162,3 dk'ya çıkarken önerilen sistemin süresi 13,0 ± 5,9 dk'da kalmaktadır (fark 90,3 dk). Hatay'da (H-Z1) katı kuralda 70 kenar kapanmakta, R0 ortalaması 25,7 dk, R3 10,8 dk (fark 14,9 dk); orta/gevşek kuralda 194 kenar kapanmakta, R0 49,8 dk, R3 11,0 dk (fark 38,8 dk) olmaktadır.</w:t>
       </w:r>
     </w:p>
     <w:p>
@@ -30081,7 +30081,7 @@
         <w:rPr>
           <w:highlight w:val="yellow"/>
         </w:rPr>
-        <w:t xml:space="preserve">Bu durum, geçilebilirlik eşlemesinin sonuç üzerindeki belirleyiciliğini somut biçimde göstermektedir: aynı yer gerçeğinden, seçilen kurala göre Kahramanmaraş'ta 406 kenar kapanmakta ya da hiçbir kenar kapanmamaktadır; H-Z1 ve K-Z1 toplamında R0 ile önerilen sistem arasındaki görev başına ortalama fark katı kuralda 3,6 dk, orta/gevşek kuralda 39,1 dk olmaktadır (Tablo </w:t>
+        <w:t xml:space="preserve">Bu durum, geçilebilirlik eşlemesinin sonuç üzerindeki belirleyiciliğini somut biçimde göstermektedir: aynı yer gerçeğinden, seçilen kurala göre Kahramanmaraş'ta 406 kenar kapanmakta ya da hiçbir kenar kapanmamaktadır; H-Z1 ve K-Z1 toplamında R0 ile önerilen sistem arasındaki görev başına ortalama fark katı kuralda 7,5 dk, orta/gevşek kuralda 64,1 dk olmaktadır (Tablo </w:t>
       </w:r>
       <w:r>
         <w:rPr>
@@ -30123,7 +30123,7 @@
         <w:rPr>
           <w:highlight w:val="yellow"/>
         </w:rPr>
-        <w:t>). Damaged derecesinin geçilemezlik anlamına gelip gelmediği uydu görüntüsünden karar verilebilecek bir soru değildir; bu nedenle tek bir kural esas alınmamış ve üç kuralın sonuçları birlikte raporlanmıştır. Önerilen sistemin (R3) kendi süresi kurala görece duyarsızdır (10,0-11,5 dk arası); kuralın asıl belirlediği büyüklük, kapanma bilgisine sahip olmayan bir ekibin ne kadar kayıp yaşayacağıdır.</w:t>
+        <w:t>). Damaged derecesinin geçilemezlik anlamına gelip gelmediği uydu görüntüsünden karar verilebilecek bir soru değildir; bu nedenle tek bir kural esas alınmamış ve üç kuralın sonuçları birlikte raporlanmıştır. Önerilen sistemin (R3) kendi süresi kurala görece duyarsızdır (10,8-13,0 dk arası); kuralın asıl belirlediği büyüklük, kapanma bilgisine sahip olmayan bir ekibin ne kadar kayıp yaşayacağıdır.</w:t>
       </w:r>
     </w:p>
     <w:p>
@@ -32779,7 +32779,7 @@
         <w:t>Kurgu ve kısıt.</w:t>
       </w:r>
       <w:r>
-        <w:t xml:space="preserve"> Veri kümesi 454 kayıt ve 18 öznitelikten oluşmaktadır; öznitelikler konum (enlem, boylam, derinlik, faya uzaklık), yedi günlük kayan pencere istatistikleri (ortalama, standart sapma, en büyük değer, olay sayısı) ve döngüsel kodlanmış zaman bileşenlerini içermektedir. Katalog 29 Nisan 2022 – 4 Ekim 2024 aralığını kapsamaktadır. Bölme, zamansal sızıntıyı önlemek amacıyla rastgele değil </w:t>
+        <w:t xml:space="preserve"> Veri kümesi 13 609 kayıt ve 18 öznitelikten oluşmaktadır; öznitelikler konum (enlem, boylam, derinlik, faya uzaklık), yedi günlük kayan pencere istatistikleri (ortalama, standart sapma, en büyük değer, olay sayısı) ve döngüsel kodlanmış zaman bileşenlerini içermektedir. Katalog 19 Haziran 1934 – 2 Ağustos 2026 aralığını kapsamaktadır. Bölme, zamansal sızıntıyı önlemek amacıyla rastgele değil </w:t>
       </w:r>
       <w:r>
         <w:rPr>
@@ -32794,7 +32794,7 @@
         <w:rPr>
           <w:b/>
         </w:rPr>
-        <w:t>Pozitif sınıf oranı 0,687'dir</w:t>
+        <w:t>Pozitif sınıf oranı 0,298'dir</w:t>
       </w:r>
       <w:r>
         <w:t>; bu, aşağıdaki PR-AUC değerlerinin karşılaştırılması gereken taban çizgisidir.</w:t>
@@ -32886,7 +32886,7 @@
         <w:t>n</w:t>
       </w:r>
       <w:r>
-        <w:t xml:space="preserve"> = 454, beş katlı ileri yürüyen bölme, pozitif oran 0,687).</w:t>
+        <w:t xml:space="preserve"> = 13 609, beş katlı ileri yürüyen bölme, pozitif oran 0,298).</w:t>
       </w:r>
     </w:p>
     <w:tbl>
@@ -33072,7 +33072,7 @@
               <w:rPr>
                 <w:sz w:val="17"/>
               </w:rPr>
-              <w:t>CatBoost [48] (esas alınan)</w:t>
+              <w:t>Lojistik regresyon</w:t>
             </w:r>
           </w:p>
         </w:tc>
@@ -33089,7 +33089,7 @@
                 <w:b/>
                 <w:sz w:val="17"/>
               </w:rPr>
-              <w:t>0,8465 ± 0,0935</w:t>
+              <w:t>0,6370 ± 0,0637</w:t>
             </w:r>
           </w:p>
         </w:tc>
@@ -33105,7 +33105,7 @@
               <w:rPr>
                 <w:sz w:val="17"/>
               </w:rPr>
-              <w:t>0,9011</w:t>
+              <w:t>0,4231</w:t>
             </w:r>
           </w:p>
         </w:tc>
@@ -33121,7 +33121,7 @@
               <w:rPr>
                 <w:sz w:val="17"/>
               </w:rPr>
-              <w:t>0,8525</w:t>
+              <w:t>0,4465</w:t>
             </w:r>
           </w:p>
         </w:tc>
@@ -33138,7 +33138,7 @@
                 <w:b/>
                 <w:sz w:val="17"/>
               </w:rPr>
-              <w:t>0,7092</w:t>
+              <w:t>0,5784</w:t>
             </w:r>
           </w:p>
         </w:tc>
@@ -33154,7 +33154,7 @@
               <w:rPr>
                 <w:sz w:val="17"/>
               </w:rPr>
-              <w:t>0,1368</w:t>
+              <w:t>0,2441</w:t>
             </w:r>
           </w:p>
         </w:tc>
@@ -33171,7 +33171,7 @@
                 <w:b/>
                 <w:sz w:val="17"/>
               </w:rPr>
-              <w:t>0,4447</w:t>
+              <w:t>0,1551</w:t>
             </w:r>
           </w:p>
         </w:tc>
@@ -33187,7 +33187,7 @@
               <w:rPr>
                 <w:sz w:val="17"/>
               </w:rPr>
-              <w:t>14,61</w:t>
+              <w:t>0,47</w:t>
             </w:r>
           </w:p>
         </w:tc>
@@ -33208,7 +33208,7 @@
               <w:rPr>
                 <w:sz w:val="17"/>
               </w:rPr>
-              <w:t>Rastgele orman [53]</w:t>
+              <w:t>Çok katmanlı algılayıcı</w:t>
             </w:r>
           </w:p>
         </w:tc>
@@ -33224,7 +33224,7 @@
               <w:rPr>
                 <w:sz w:val="17"/>
               </w:rPr>
-              <w:t>0,8417 ± 0,0920</w:t>
+              <w:t>0,6329 ± 0,0784</w:t>
             </w:r>
           </w:p>
         </w:tc>
@@ -33241,7 +33241,7 @@
                 <w:b/>
                 <w:sz w:val="17"/>
               </w:rPr>
-              <w:t>0,9058</w:t>
+              <w:t>0,4168</w:t>
             </w:r>
           </w:p>
         </w:tc>
@@ -33257,7 +33257,7 @@
               <w:rPr>
                 <w:sz w:val="17"/>
               </w:rPr>
-              <w:t>0,8572</w:t>
+              <w:t>0,2831</w:t>
             </w:r>
           </w:p>
         </w:tc>
@@ -33273,7 +33273,7 @@
               <w:rPr>
                 <w:sz w:val="17"/>
               </w:rPr>
-              <w:t>0,6817</w:t>
+              <w:t>0,5651</w:t>
             </w:r>
           </w:p>
         </w:tc>
@@ -33290,7 +33290,7 @@
                 <w:b/>
                 <w:sz w:val="17"/>
               </w:rPr>
-              <w:t>0,1318</w:t>
+              <w:t>0,2104</w:t>
             </w:r>
           </w:p>
         </w:tc>
@@ -33306,7 +33306,7 @@
               <w:rPr>
                 <w:sz w:val="17"/>
               </w:rPr>
-              <w:t>0,3958</w:t>
+              <w:t>0,1522</w:t>
             </w:r>
           </w:p>
         </w:tc>
@@ -33322,7 +33322,7 @@
               <w:rPr>
                 <w:sz w:val="17"/>
               </w:rPr>
-              <w:t>6,32</w:t>
+              <w:t>6,23</w:t>
             </w:r>
           </w:p>
         </w:tc>
@@ -33343,7 +33343,7 @@
               <w:rPr>
                 <w:sz w:val="17"/>
               </w:rPr>
-              <w:t>XGBoost [54]</w:t>
+              <w:t>Rastgele orman [53]</w:t>
             </w:r>
           </w:p>
         </w:tc>
@@ -33359,7 +33359,7 @@
               <w:rPr>
                 <w:sz w:val="17"/>
               </w:rPr>
-              <w:t>0,7962 ± 0,1554</w:t>
+              <w:t>0,6205 ± 0,0532</w:t>
             </w:r>
           </w:p>
         </w:tc>
@@ -33375,7 +33375,7 @@
               <w:rPr>
                 <w:sz w:val="17"/>
               </w:rPr>
-              <w:t>0,8907</w:t>
+              <w:t>0,3900</w:t>
             </w:r>
           </w:p>
         </w:tc>
@@ -33392,7 +33392,7 @@
                 <w:b/>
                 <w:sz w:val="17"/>
               </w:rPr>
-              <w:t>0,8610</w:t>
+              <w:t>0,1049</w:t>
             </w:r>
           </w:p>
         </w:tc>
@@ -33408,7 +33408,7 @@
               <w:rPr>
                 <w:sz w:val="17"/>
               </w:rPr>
-              <w:t>0,6904</w:t>
+              <w:t>0,5197</w:t>
             </w:r>
           </w:p>
         </w:tc>
@@ -33424,7 +33424,7 @@
               <w:rPr>
                 <w:sz w:val="17"/>
               </w:rPr>
-              <w:t>0,1374</w:t>
+              <w:t>0,1996</w:t>
             </w:r>
           </w:p>
         </w:tc>
@@ -33440,7 +33440,7 @@
               <w:rPr>
                 <w:sz w:val="17"/>
               </w:rPr>
-              <w:t>0,4179</w:t>
+              <w:t>0,0802</w:t>
             </w:r>
           </w:p>
         </w:tc>
@@ -33456,7 +33456,7 @@
               <w:rPr>
                 <w:sz w:val="17"/>
               </w:rPr>
-              <w:t>10,31</w:t>
+              <w:t>13,72</w:t>
             </w:r>
           </w:p>
         </w:tc>
@@ -33477,7 +33477,7 @@
               <w:rPr>
                 <w:sz w:val="17"/>
               </w:rPr>
-              <w:t>Lojistik regresyon</w:t>
+              <w:t>CatBoost [48] (esas alınan)</w:t>
             </w:r>
           </w:p>
         </w:tc>
@@ -33493,7 +33493,7 @@
               <w:rPr>
                 <w:sz w:val="17"/>
               </w:rPr>
-              <w:t>0,7776 ± 0,0449</w:t>
+              <w:t>0,5928 ± 0,0388</w:t>
             </w:r>
           </w:p>
         </w:tc>
@@ -33509,7 +33509,7 @@
               <w:rPr>
                 <w:sz w:val="17"/>
               </w:rPr>
-              <w:t>0,8665</w:t>
+              <w:t>0,3607</w:t>
             </w:r>
           </w:p>
         </w:tc>
@@ -33525,7 +33525,7 @@
               <w:rPr>
                 <w:sz w:val="17"/>
               </w:rPr>
-              <w:t>0,8118</w:t>
+              <w:t>0,2170</w:t>
             </w:r>
           </w:p>
         </w:tc>
@@ -33541,7 +33541,7 @@
               <w:rPr>
                 <w:sz w:val="17"/>
               </w:rPr>
-              <w:t>0,6758</w:t>
+              <w:t>0,5271</w:t>
             </w:r>
           </w:p>
         </w:tc>
@@ -33557,7 +33557,7 @@
               <w:rPr>
                 <w:sz w:val="17"/>
               </w:rPr>
-              <w:t>0,1511</w:t>
+              <w:t>0,2295</w:t>
             </w:r>
           </w:p>
         </w:tc>
@@ -33573,7 +33573,7 @@
               <w:rPr>
                 <w:sz w:val="17"/>
               </w:rPr>
-              <w:t>0,4228</w:t>
+              <w:t>0,0753</w:t>
             </w:r>
           </w:p>
         </w:tc>
@@ -33589,7 +33589,7 @@
               <w:rPr>
                 <w:sz w:val="17"/>
               </w:rPr>
-              <w:t>0,32</w:t>
+              <w:t>48,01</w:t>
             </w:r>
           </w:p>
         </w:tc>
@@ -33610,7 +33610,7 @@
               <w:rPr>
                 <w:sz w:val="17"/>
               </w:rPr>
-              <w:t>Yığınlanmış topluluk (CatBoost + LightGBM + RO)</w:t>
+              <w:t>XGBoost [54]</w:t>
             </w:r>
           </w:p>
         </w:tc>
@@ -33626,7 +33626,7 @@
               <w:rPr>
                 <w:sz w:val="17"/>
               </w:rPr>
-              <w:t>0,7338 ± 0,2670</w:t>
+              <w:t>0,5861 ± 0,0462</w:t>
             </w:r>
           </w:p>
         </w:tc>
@@ -33642,7 +33642,7 @@
               <w:rPr>
                 <w:sz w:val="17"/>
               </w:rPr>
-              <w:t>0,8729</w:t>
+              <w:t>0,3638</w:t>
             </w:r>
           </w:p>
         </w:tc>
@@ -33658,7 +33658,7 @@
               <w:rPr>
                 <w:sz w:val="17"/>
               </w:rPr>
-              <w:t>0,6625</w:t>
+              <w:t>0,1848</w:t>
             </w:r>
           </w:p>
         </w:tc>
@@ -33674,7 +33674,7 @@
               <w:rPr>
                 <w:sz w:val="17"/>
               </w:rPr>
-              <w:t>0,4613</w:t>
+              <w:t>0,5262</w:t>
             </w:r>
           </w:p>
         </w:tc>
@@ -33690,7 +33690,7 @@
               <w:rPr>
                 <w:sz w:val="17"/>
               </w:rPr>
-              <w:t>0,2259</w:t>
+              <w:t>0,2299</w:t>
             </w:r>
           </w:p>
         </w:tc>
@@ -33706,7 +33706,7 @@
               <w:rPr>
                 <w:sz w:val="17"/>
               </w:rPr>
-              <w:t>−0,0225</w:t>
+              <w:t>0,0784</w:t>
             </w:r>
           </w:p>
         </w:tc>
@@ -33722,7 +33722,7 @@
               <w:rPr>
                 <w:sz w:val="17"/>
               </w:rPr>
-              <w:t>33,88</w:t>
+              <w:t>30,67</w:t>
             </w:r>
           </w:p>
         </w:tc>
@@ -33759,7 +33759,7 @@
               <w:rPr>
                 <w:sz w:val="17"/>
               </w:rPr>
-              <w:t>0,7168 ± 0,2294</w:t>
+              <w:t>0,5810 ± 0,0475</w:t>
             </w:r>
           </w:p>
         </w:tc>
@@ -33775,7 +33775,7 @@
               <w:rPr>
                 <w:sz w:val="17"/>
               </w:rPr>
-              <w:t>0,8767</w:t>
+              <w:t>0,3592</w:t>
             </w:r>
           </w:p>
         </w:tc>
@@ -33791,7 +33791,7 @@
               <w:rPr>
                 <w:sz w:val="17"/>
               </w:rPr>
-              <w:t>0,8274</w:t>
+              <w:t>0,1877</w:t>
             </w:r>
           </w:p>
         </w:tc>
@@ -33807,7 +33807,7 @@
               <w:rPr>
                 <w:sz w:val="17"/>
               </w:rPr>
-              <w:t>0,6154</w:t>
+              <w:t>0,5234</w:t>
             </w:r>
           </w:p>
         </w:tc>
@@ -33823,7 +33823,7 @@
               <w:rPr>
                 <w:sz w:val="17"/>
               </w:rPr>
-              <w:t>0,1724</w:t>
+              <w:t>0,2308</w:t>
             </w:r>
           </w:p>
         </w:tc>
@@ -33839,7 +33839,7 @@
               <w:rPr>
                 <w:sz w:val="17"/>
               </w:rPr>
-              <w:t>0,2875</w:t>
+              <w:t>0,0670</w:t>
             </w:r>
           </w:p>
         </w:tc>
@@ -33855,7 +33855,7 @@
               <w:rPr>
                 <w:sz w:val="17"/>
               </w:rPr>
-              <w:t>1,45</w:t>
+              <w:t>12,92</w:t>
             </w:r>
           </w:p>
         </w:tc>
@@ -33876,7 +33876,7 @@
               <w:rPr>
                 <w:sz w:val="17"/>
               </w:rPr>
-              <w:t>Çok katmanlı algılayıcı</w:t>
+              <w:t>Naif — Yalnızca fay mesafesi (R0a)</w:t>
             </w:r>
           </w:p>
         </w:tc>
@@ -33892,7 +33892,7 @@
               <w:rPr>
                 <w:sz w:val="17"/>
               </w:rPr>
-              <w:t>0,4276 ± 0,1088</w:t>
+              <w:t>0,5333 ± 0,0283</w:t>
             </w:r>
           </w:p>
         </w:tc>
@@ -33908,7 +33908,7 @@
               <w:rPr>
                 <w:sz w:val="17"/>
               </w:rPr>
-              <w:t>0,7108</w:t>
+              <w:t>0,3074</w:t>
             </w:r>
           </w:p>
         </w:tc>
@@ -33924,7 +33924,7 @@
               <w:rPr>
                 <w:sz w:val="17"/>
               </w:rPr>
-              <w:t>0,6742</w:t>
+              <w:t>0,4433</w:t>
             </w:r>
           </w:p>
         </w:tc>
@@ -33940,7 +33940,7 @@
               <w:rPr>
                 <w:sz w:val="17"/>
               </w:rPr>
-              <w:t>0,4532</w:t>
+              <w:t>0,5064</w:t>
             </w:r>
           </w:p>
         </w:tc>
@@ -33956,7 +33956,7 @@
               <w:rPr>
                 <w:sz w:val="17"/>
               </w:rPr>
-              <w:t>0,2288</w:t>
+              <w:t>0,5207</w:t>
             </w:r>
           </w:p>
         </w:tc>
@@ -33972,7 +33972,7 @@
               <w:rPr>
                 <w:sz w:val="17"/>
               </w:rPr>
-              <w:t>−0,0443</w:t>
+              <w:t>0,0305</w:t>
             </w:r>
           </w:p>
         </w:tc>
@@ -33988,7 +33988,7 @@
               <w:rPr>
                 <w:sz w:val="17"/>
               </w:rPr>
-              <w:t>0,40</w:t>
+              <w:t>–</w:t>
             </w:r>
           </w:p>
         </w:tc>
@@ -34003,7 +34003,7 @@
           </w:tcPr>
           <w:p>
             <w:r>
-              <w:t>Naif — Yalnızca fay mesafesi (R0a)</w:t>
+              <w:t>Yığınlanmış topluluk (CatBoost + LightGBM + RO)</w:t>
             </w:r>
           </w:p>
         </w:tc>
@@ -34013,7 +34013,7 @@
           </w:tcPr>
           <w:p>
             <w:r>
-              <w:t>0,6364 ± 0,0748</w:t>
+              <w:t>0,5168 ± 0,0576</w:t>
             </w:r>
           </w:p>
         </w:tc>
@@ -34023,7 +34023,7 @@
           </w:tcPr>
           <w:p>
             <w:r>
-              <w:t>0,7544</w:t>
+              <w:t>0,3127</w:t>
             </w:r>
           </w:p>
         </w:tc>
@@ -34033,7 +34033,7 @@
           </w:tcPr>
           <w:p>
             <w:r>
-              <w:t>0,8539</w:t>
+              <w:t>0,4027</w:t>
             </w:r>
           </w:p>
         </w:tc>
@@ -34043,7 +34043,7 @@
           </w:tcPr>
           <w:p>
             <w:r>
-              <w:t>0,6847</w:t>
+              <w:t>0,5137</w:t>
             </w:r>
           </w:p>
         </w:tc>
@@ -34053,7 +34053,7 @@
           </w:tcPr>
           <w:p>
             <w:r>
-              <w:t>0,1830</w:t>
+              <w:t>0,2594</w:t>
             </w:r>
           </w:p>
         </w:tc>
@@ -34063,7 +34063,7 @@
           </w:tcPr>
           <w:p>
             <w:r>
-              <w:t>0,4755</w:t>
+              <w:t>0,0318</w:t>
             </w:r>
           </w:p>
         </w:tc>
@@ -34073,7 +34073,7 @@
           </w:tcPr>
           <w:p>
             <w:r>
-              <w:t>–</w:t>
+              <w:t>162,77</w:t>
             </w:r>
           </w:p>
         </w:tc>
@@ -34098,7 +34098,7 @@
           </w:tcPr>
           <w:p>
             <w:r>
-              <w:t>0,5005 ± 0,0984</w:t>
+              <w:t>0,5000 ± 0,0000</w:t>
             </w:r>
           </w:p>
         </w:tc>
@@ -34108,7 +34108,7 @@
           </w:tcPr>
           <w:p>
             <w:r>
-              <w:t>0,7255</w:t>
+              <w:t>0,2920</w:t>
             </w:r>
           </w:p>
         </w:tc>
@@ -34118,7 +34118,7 @@
           </w:tcPr>
           <w:p>
             <w:r>
-              <w:t>0,5157</w:t>
+              <w:t>0,0000</w:t>
             </w:r>
           </w:p>
         </w:tc>
@@ -34128,7 +34128,7 @@
           </w:tcPr>
           <w:p>
             <w:r>
-              <w:t>0,4852</w:t>
+              <w:t>0,5000</w:t>
             </w:r>
           </w:p>
         </w:tc>
@@ -34138,7 +34138,7 @@
           </w:tcPr>
           <w:p>
             <w:r>
-              <w:t>0,3564</w:t>
+              <w:t>0,2920</w:t>
             </w:r>
           </w:p>
         </w:tc>
@@ -34148,11 +34148,9 @@
           </w:tcPr>
           <w:p>
             <w:r>
-              <w:t>−</w:t>
-            </w:r>
-            <w:r>
-              <w:t>0,0411</w:t>
-            </w:r>
+              <w:t>0,0000</w:t>
+            </w:r>
+            <w:r/>
           </w:p>
         </w:tc>
         <w:tc>
@@ -34181,51 +34179,50 @@
         <w:t>Birincisi, PR-AUC değerleri temel oran çıkarılmadan yorumlanmamalıdır.</w:t>
       </w:r>
       <w:r>
-        <w:t xml:space="preserve"> Pozitif oran 0,687 olduğundan rastgele bir sınıflandırıcının beklenen PR-AUC'si de 0,687'dir. CatBoost'un 0,9011 değeri bu tabanın 0,214 üzerindedir; tablodaki en düşük değer olan 0,7108 ise yalnızca 0,024 üzerindedir. </w:t>
-      </w:r>
-      <w:r>
-        <w:rPr>
-          <w:b/>
-        </w:rPr>
-        <w:t>Ham PR-AUC değerleri bu görevde yanıltıcı derecede yüksek görünmektedir.</w:t>
-      </w:r>
-    </w:p>
-    <w:p>
-      <w:r>
-        <w:rPr>
-          <w:b/>
-        </w:rPr>
-        <w:lastRenderedPageBreak/>
-        <w:t>İkincisi, esas alınan model seçimi dar bir farkla desteklenmektedir.</w:t>
-      </w:r>
-      <w:r>
-        <w:t xml:space="preserve"> CatBoost ROC-AUC, dengeli doğruluk ve MCC ölçütlerinde önde olmakla birlikte, rastgele ormanla arasındaki ROC-AUC farkı (0,0048) her iki modelin kat standart sapmasının (≈ 0,09) çok altındadır. </w:t>
-      </w:r>
-      <w:r>
-        <w:rPr>
-          <w:b/>
-        </w:rPr>
-        <w:t>Bu fark istatistiksel olarak anlamlı değildir</w:t>
-      </w:r>
-      <w:r>
-        <w:t>; rastgele orman ayrıca daha iyi PR-AUC ve daha iyi Brier skoru vermektedir. CatBoost'un tercihi, ölçülen üstünlükten çok ölçütler arası tutarlılığına dayanmaktadır.</w:t>
-      </w:r>
-    </w:p>
-    <w:p>
-      <w:r>
-        <w:rPr>
-          <w:b/>
-        </w:rPr>
-        <w:t>Üçüncüsü, iki model taban çizgisinin altında kalmıştır.</w:t>
-      </w:r>
-      <w:r>
-        <w:t xml:space="preserve"> Çok katmanlı algılayıcının ROC-AUC değeri 0,4276'dır; bu, 0,50'lik rastgele tahmin düzeyinin altındadır ve model bu veri boyutunda öğrenememiştir. Yığınlanmış topluluğun MCC değeri −0,0225 ve kat standart sapması 0,2670'tir; 454 kayıtlık bir kümede üç modelli bir yığınlama için gereken üst düzey öğrenici verisi bulunmamaktadır. </w:t>
-      </w:r>
-      <w:r>
-        <w:rPr>
-          <w:b/>
-        </w:rPr>
-        <w:t>Her iki sonuç da bir mimari eleştirisi değil, örneklem yetersizliği göstergesidir.</w:t>
+        <w:t xml:space="preserve"> Pozitif oran 0,298 olduğundan rastgele bir sınıflandırıcının beklenen PR-AUC'si de 0,298'dir. En yüksek değeri veren lojistik regresyonun 0,4231'i bu tabanın 0,125 üzerindedir; öğrenilmiş modeller arasında en düşük değer olan LightGBM'in 0,3592'si ise yalnızca 0,061 üzerindedir. Yığınlanmış topluluk (0,3127) ve naif sismisite tabanı (0,2920) temel orana neredeyse eşit kalmaktadır. </w:t>
+      </w:r>
+      <w:r>
+        <w:rPr>
+          <w:b/>
+        </w:rPr>
+        <w:t>Ham PR-AUC değerleri bu kez düşük görünmekte, ancak temel oranın kendisi de düşük olduğundan mutlak büyüklükleri değil temel orana göre kazançları esas alınmalıdır.</w:t>
+      </w:r>
+    </w:p>
+    <w:p>
+      <w:r>
+        <w:rPr>
+          <w:b/>
+        </w:rPr>
+        <w:t>İkincisi, esas alınan model bu karşılaştırmada en iyi sonucu vermemektedir.</w:t>
+      </w:r>
+      <w:r>
+        <w:t xml:space="preserve"> ROC-AUC, dengeli doğruluk ve MCC ölçütlerinin üçünde de en yüksek değeri lojistik regresyon vermektedir (sırasıyla 0,6370, 0,5784, 0,1551); CatBoost bu üç ölçütte de dördüncü sıradadır (0,5928, 0,5271, 0,0753). </w:t>
+      </w:r>
+      <w:r>
+        <w:rPr>
+          <w:b/>
+        </w:rPr>
+        <w:t>Lojistik regresyon ile CatBoost arasındaki ROC-AUC farkı (0,0442) iki modelin kat standart sapmalarının (sırasıyla 0,0637 ve 0,0388) toplamına yakındır; fark istatistiksel olarak güçlü değildir, ancak yönü tutarlıdır</w:t>
+      </w:r>
+      <w:r>
+        <w:t>. CatBoost'un üretim sisteminde kullanılmaya devam etmesi bu karşılaştırmadan bağımsız, önceden alınmış bir mühendislik kararıdır; bu bölümün bulgusu, kararın bu veri kümesinde ölçülen başarımla desteklenmediğidir.</w:t>
+      </w:r>
+    </w:p>
+    <w:p>
+      <w:r>
+        <w:rPr>
+          <w:b/>
+        </w:rPr>
+        <w:t>Üçüncüsü, yığınlanmış topluluk modeli beklenenin gerisinde kalmıştır.</w:t>
+      </w:r>
+      <w:r>
+        <w:t xml:space="preserve"> ROC-AUC değeri (0,5168) yedi model arasında en düşüktür ve rastgele düzeye (0,50) yakındır; MCC değeri de (0,0318) en düşük ikinci değerdir. 13 609 kayıtlık kümede bile üç temel modelin (CatBoost, LightGBM, rastgele orman) çıktılarını birleştiren üst düzey öğrenicinin bu temel modellerin hiçbirini tek başına geçememesi, yığınlamanın bu görevde katma değer üretmediğini göstermektedir. </w:t>
+      </w:r>
+      <w:r>
+        <w:rPr>
+          <w:b/>
+        </w:rPr>
+        <w:t>Bu, bir mimari eleştirisi değil örneklem büyüklüğünün artmasıyla ortaya çıkan bir istikrarsızlık göstergesidir.</w:t>
       </w:r>
     </w:p>
     <w:p>
@@ -34236,15 +34233,15 @@
         <w:t>Dördüncüsü, kalibrasyon ölçülmüş ancak yeterli bulunmamıştır.</w:t>
       </w:r>
       <w:r>
-        <w:t xml:space="preserve"> En iyi Brier skoru 0,1318'dir. Skorlar Bölüm 3.7'de operatöre kategori olarak sunulduğundan olasılık kalibrasyonu doğrudan karar kalitesine yansımaktadır; izotonik veya Platt ölçekleme bu sürümde uygulanmamıştır.</w:t>
-      </w:r>
-    </w:p>
-    <w:p>
-      <w:r>
-        <w:t>Beşincisi, naif tabanlarla karşılaştırma modellerin kattığı değeri sınırlı ama gerçek göstermektedir. Yalnızca fay mesafesine dayalı sıralama (R0a) PR-AUC = 0,7544 (temel oranın 0,067 üzerinde) ve MCC = 0,4755 vermektedir; bu değer ROC-AUC'de üç öğrenilmiş modelin gerisinde kalsa da MCC'de LightGBM, yığınlanmış topluluk ve çok katmanlı algılayıcıdan daha iyidir. Yalnızca geçmiş sismisite yoğunluğuna (yedi günlük ortalama büyüklük) dayalı sıralama (R0b) ise ROC-AUC = 0,5005 ile rastgele düzeyi geçememektedir</w:t>
-      </w:r>
-      <w:r>
-        <w:t>. Bu, öğrenilmiş modellerin kattığı değerin büyük ölçüde fay yakınlığı ötesindeki öznitelik bileşiminden geldiğini, buna karşın tek başına yakınlık sezgisinin gözden kaçırılmaması gereken güçlü bir taban oluşturduğunu göstermektedir.</w:t>
+        <w:t xml:space="preserve"> En iyi Brier skoru rastgele ormanda 0,1996'dır; hiçbir model 0,20'nin belirgin altına inmemektedir. Skorlar Bölüm 3.7'de operatöre kategori olarak sunulduğundan olasılık kalibrasyonu doğrudan karar kalitesine yansımaktadır; izotonik veya Platt ölçekleme bu sürümde uygulanmamıştır.</w:t>
+      </w:r>
+    </w:p>
+    <w:p>
+      <w:r>
+        <w:t>Beşincisi, naif tabanlarla karşılaştırma öğrenilmiş modellerin kattığı değerin bu kez daha belirgin olduğunu göstermektedir. Yalnızca fay mesafesine dayalı sıralama (R0a) PR-AUC = 0,3074 (temel oranın yalnızca 0,009 üzerinde) ve MCC = 0,0305 vermektedir; bu değer yedi öğrenilmiş modelin altısından düşüktür, yalnızca yığınlanmış topluluğa (0,0318) yakındır. Yalnızca geçmiş sismisite yoğunluğuna (yedi günlük ortalama büyüklük) dayalı sıralama (R0b) ise ROC-AUC = 0,5000 ile tam olarak rastgele düzeydedir (MCC = 0)</w:t>
+      </w:r>
+      <w:r>
+        <w:t>. Bu, öğrenilmiş modellerin kattığı değerin büyük ölçüde fay yakınlığı ötesindeki öznitelik bileşiminden geldiğini göstermektedir; tek başına yakınlık sezgisi bu kez güçlü bir taban oluşturmamaktadır.</w:t>
       </w:r>
     </w:p>
     <w:p>
@@ -34620,7 +34617,7 @@
         <w:rPr>
           <w:sz w:val="19"/>
         </w:rPr>
-        <w:t xml:space="preserve"> Modellerin ROC (üstte) ve kesinlik–duyarlılık (altta) eğrileri. PR grafiğindeki taban çizgisi 0,687'lik pozitif sınıf oranına karşılık gelmektedir; eğrilerin bu çizgiye göre konumu, ham PR-AUC değerlerinden daha bilgilendiricidir.</w:t>
+        <w:t xml:space="preserve"> Modellerin ROC (üstte) ve kesinlik–duyarlılık (altta) eğrileri. PR grafiğindeki taban çizgisi 0,298'lik pozitif sınıf oranına karşılık gelmektedir; eğrilerin bu çizgiye göre konumu, ham PR-AUC değerlerinden daha bilgilendiricidir.</w:t>
       </w:r>
     </w:p>
     <w:p>
@@ -34762,14 +34759,14 @@
         <w:rPr>
           <w:sz w:val="19"/>
         </w:rPr>
-        <w:t xml:space="preserve"> Beş katlı ileri yürüyen bölmede kat bazında ROC-AUC dağılımı. Kat aralığının genişliği, 454 kayıtlık kümede model sıralamasının ne ölçüde kırılgan olduğunu göstermektedir; yığınlanmış topluluk ve LightGBM'de standart sapma </w:t>
+        <w:t xml:space="preserve"> Beş katlı ileri yürüyen bölmede kat bazında ROC-AUC dağılımı. Kat aralığının genişliği, 13 609 kayıtlık kümede model sıralamasının kata göre nasıl değiştiğini göstermektedir; kat standart sapması tüm modellerde </w:t>
       </w:r>
       <w:r>
         <w:rPr>
           <w:sz w:val="19"/>
           <w:highlight w:val="yellow"/>
         </w:rPr>
-        <w:t>0,22'nin üzerindedir. Yedi modelin tamamında en düşük ROC-AUC değeri 1. kattadır.</w:t>
+        <w:t>0,04–0,08 aralığındadır. Yedi modelin beşinde en düşük ROC-AUC değeri 1. kattadır.</w:t>
       </w:r>
     </w:p>
     <w:p>
@@ -35103,13 +35100,13 @@
     </w:p>
     <w:p>
       <w:r>
-        <w:t xml:space="preserve">Karşılaştırma üç noktada sınırlıdır: (i) 454 kayıt, kat başına 75 sınama örneği anlamına gelmektedir ve kat standart sapmalarının büyüklüğü (0,04–0,27) doğrudan bu darlıktan doğmaktadır; (ii) </w:t>
-      </w:r>
-      <w:r>
-        <w:rPr>
-          <w:b/>
-        </w:rPr>
-        <w:t>katalogda artçı ayıklaması (declustering) yapılmamıştır</w:t>
+        <w:t xml:space="preserve">Karşılaştırma üç noktada sınırlıdır: (i) 13 609 kayıt, kat başına ortalama 2268 sınama örneği anlamına gelmektedir; gerçek modellerin ROC-AUC kat standart sapmaları 0,04–0,08 aralığındadır; (ii) </w:t>
+      </w:r>
+      <w:r>
+        <w:rPr>
+          <w:b/>
+        </w:rPr>
+        <w:t>kullanılan basit kümelenmeden arındırma yöntemi sabit bir 1 gün / 50 km penceresi kullanmakta ve bu pencere dışında kalan bazı artçı sarsıntıları ana şok olarak bırakmış olabilir</w:t>
       </w:r>
       <w:r>
         <w:t xml:space="preserve">, dolayısıyla ana şok–artçı dizilerinin zamansal özilintisi başarımı iyimser yönde sapmaya uğratıyor olabilir; (iii) Denklem (7)'deki uzman tanımlı risk ağırlıkları bu karşılaştırmaya dâhil değildir, duyarlılıkları </w:t>
@@ -35193,7 +35190,7 @@
         <w:rPr>
           <w:highlight w:val="yellow"/>
         </w:rPr>
-        <w:t xml:space="preserve">Sekiz bölgelik sentetik senaryoda görev başına ortalama toplam müdahale süresi önerilen sistem için 13,0 ± 8,3 dk, kapanma-bilgisiz naif ajan için 189,6 ± 205,9 dk ölçülmüştür. Farkın tek bir sayıyla raporlanması yanıltıcı olurdu; çünkü bileşenleri türdeş değildir. Denklem (11) uyarınca farkın %97,4'ü ceza teriminden, kalanı kat edilen yol farkından kaynaklanmaktadır. Tablo </w:t>
+        <w:t xml:space="preserve">Sekiz bölgelik sentetik senaryoda görev başına ortalama toplam müdahale süresi önerilen sistem için 12,8 ± 8,3 dk, kapanma-bilgisiz naif ajan için 184,9 ± 200,2 dk ölçülmüştür. Farkın tek bir sayıyla raporlanması yanıltıcı olurdu; çünkü bileşenleri türdeş değildir. Denklem (11) uyarınca farkın %97,4'ü ceza teriminden, kalanı kat edilen yol farkından kaynaklanmaktadır. Tablo </w:t>
       </w:r>
       <w:r>
         <w:fldChar w:fldCharType="begin"/>
@@ -35218,7 +35215,7 @@
         <w:rPr>
           <w:highlight w:val="yellow"/>
         </w:rPr>
-        <w:t>'deki tarama, kazanç oranının seçilen ceza süresine monoton bağlı olduğunu ve parametreden bağımsız tabanın naif ajanın kat ettiği yolun %26,6'sı düzeyinde olduğunu göstermektedir. Kapanma farkındalığının katkısı için savunulabilir alt sınır bu parametreden bağımsız yol farkıdır; bilgi paylaşmayan ve her kapalı kenarı tek tek öğrenen R0'a göre ölçülen fark ise bir üst sınırdır. Görüş mesafeli (R1) ve bilgi paylaşan (R2) referanslara karşı bu üst sınırın yakalanan payı bu yeniden inşa edilen ağda sınırlı kalmaktadır (sırasıyla %2,8 ve %5,3); bu, önceki (kod ile doğrulanamayan) sürümde rapor edilen %80-85 düzeyindeki paylarla çelişmekte olup önceki sayılar bu sürümde geçersiz kılınmıştır.</w:t>
+        <w:t>'deki tarama, kazanç oranının seçilen ceza süresine monoton bağlı olduğunu ve parametreden bağımsız tabanın naif ajanın kat ettiği yolun %25,6'sı düzeyinde olduğunu göstermektedir. Kapanma farkındalığının katkısı için savunulabilir alt sınır bu parametreden bağımsız yol farkıdır; bilgi paylaşmayan ve her kapalı kenarı tek tek öğrenen R0'a göre ölçülen fark ise bir üst sınırdır. Görüş mesafeli (R1) ve bilgi paylaşan (R2) referanslara karşı bu üst sınırın yakalanan payı bu yeniden inşa edilen ağda sınırlı kalmaktadır (sırasıyla %2,3 ve %5,1); bu, önceki (kod ile doğrulanamayan) sürümde rapor edilen %80-85 düzeyindeki paylarla çelişmekte olup önceki sayılar bu sürümde geçersiz kılınmıştır.</w:t>
       </w:r>
     </w:p>
     <w:p>
@@ -35493,7 +35490,7 @@
     </w:p>
     <w:p>
       <w:r>
-        <w:t>(n) Bölüm 3.7'de tanımlanan deprem risk sınıflandırması için katalog verisi üzerinde kümelenmeden arındırma (declustering) uygulanmamıştır; ana şok–artçı dizilerinin zamansal özilintisi Bölüm 4.11'de tartışıldığı üzere karşılaştırma sonuçlarını iyimser yönde saptırıyor olabilir.</w:t>
+        <w:t>(n) Bölüm 3.7'de tanımlanan deprem risk sınıflandırması için katalog verisi üzerinde kullanılan kümelenmeden arındırma (declustering) yöntemi sabit ve kısa bir pencereye (1 gün / 50 km) dayanmaktadır; bu pencere dışında kalan artçı sarsıntılar ana şok olarak kalabilir ve Bölüm 4.11'de tartışıldığı üzere karşılaştırma sonuçlarını iyimser yönde saptırıyor olabilir.</w:t>
       </w:r>
     </w:p>
     <w:p>
@@ -36011,20 +36008,18 @@
               <w:rPr>
                 <w:sz w:val="19"/>
               </w:rPr>
-              <w:t>Artçı ayıklaması yapılmamış katalogda ön kıyaslama (</w:t>
+              <w:t>Ölçülmüştür (Tablo 22/23; kümelenmeden arındırılmış katalog, n = 13 609, temel oran 0,298, 5 katlı ileri yürüyen bölme): en yüksek PR-AUC lojistik regresyonda (0,4231), ROC-AUC = 0,6370 ± 0,0637, Brier = 0,2441; esas alınan CatBoost PR-AUC = 0,3607, ROC-AUC = 0,5928 ± 0,0388, Brier = 0,2295</w:t>
             </w:r>
             <w:r>
               <w:rPr>
                 <w:i/>
                 <w:sz w:val="19"/>
               </w:rPr>
-              <w:t>n</w:t>
-            </w:r>
-            <w:r>
-              <w:rPr>
-                <w:sz w:val="19"/>
-              </w:rPr>
-              <w:t xml:space="preserve"> = 454, temel oran 0,687, 5 katlı ileri yürüyen bölme): CatBoost PR-AUC = 0,901, ROC-AUC = 0,846 ± 0,093, Brier = 0,137</w:t>
+            </w:r>
+            <w:r>
+              <w:rPr>
+                <w:sz w:val="19"/>
+              </w:rPr>
             </w:r>
           </w:p>
         </w:tc>
@@ -36500,7 +36495,7 @@
         <w:rPr>
           <w:highlight w:val="yellow"/>
         </w:rPr>
-        <w:t>Ölçülen sonuçlar dört başlıkta toplanmaktadır. Birincisi sevk katmanının eşzamanlılık güvencesidir: 8 bölgede, 10 tohumun her birinde 48 ekip-hedef ataması (toplam 480) Algoritma 3 ile tamamlanmış, 400 mükerrer sevk denemesinin tamamı gerçek bir görev kilitleme sınıfı (TaskLock) tarafından engellenmiştir; bu mekanizma henüz üretim REST API'sine bağlanmamıştır. İkincisi güzergâh iç tutarlılığıdır: rotalanan güzergâhların hiçbiri kapalı bir kenardan geçmemektedir; bu, sert kapatmanın kapalı kenarları çizge görünümünden yapısal olarak dışlamasının doğrudan sonucudur. Üçüncüsü kusursuz kapanma bilgisinin değeridir: sekiz bölgelik sentetik senaryoda görev başına ortalama toplam müdahale süresi 13,0 ± 8,3 dakikaya karşılık kapanma-bilgisiz ajanda 189,6 ± 205,9 dakika ölçülmüş, farkın %97,4'ünün yeniden yönlenme ceza varsayımından kaynaklandığı belirlenmiştir. Görüş mesafeli ve bilgi paylaşan referanslara karşı bu farkın yakalanan payı bu yeniden inşa edilen ağda sınırlı kalmaktadır (sırasıyla %2,8 ve %5,3). Gerçek hasarla (EMSR648) Kahramanmaraş'ta katı kuralda fark tam olarak sıfırdır (hiç Destroyed kesim yok); orta/gevşek kuralda 39,1 dakikaya çıkmaktadır. Dördüncüsü görev tabanlı değerlendirmedir (Bölüm 4.7): bugünkü SegFormer kapanmalarıyla planlama, üç drone sahnesinde sınanan sert kullanımın 15 ayarının hiçbirinde kapanma bilgisi olmayan ajandan daha iyi sonuç vermemiştir.</w:t>
+        <w:t>Ölçülen sonuçlar dört başlıkta toplanmaktadır. Birincisi sevk katmanının eşzamanlılık güvencesidir: 8 bölgede, 10 tohumun her birinde 48 ekip-hedef ataması (toplam 480) Algoritma 3 ile tamamlanmış, 400 mükerrer sevk denemesinin tamamı gerçek bir görev kilitleme sınıfı (TaskLock) tarafından engellenmiştir; bu mekanizma henüz üretim REST API'sine bağlanmamıştır. İkincisi güzergâh iç tutarlılığıdır: rotalanan güzergâhların hiçbiri kapalı bir kenardan geçmemektedir; bu, sert kapatmanın kapalı kenarları çizge görünümünden yapısal olarak dışlamasının doğrudan sonucudur. Üçüncüsü kusursuz kapanma bilgisinin değeridir: sekiz bölgelik sentetik senaryoda görev başına ortalama toplam müdahale süresi 12,8 ± 8,3 dakikaya karşılık kapanma-bilgisiz ajanda 184,9 ± 200,2 dakika ölçülmüş, farkın %97,4'ünün yeniden yönlenme ceza varsayımından kaynaklandığı belirlenmiştir. Görüş mesafeli ve bilgi paylaşan referanslara karşı bu farkın yakalanan payı bu yeniden inşa edilen ağda sınırlı kalmaktadır (sırasıyla %2,3 ve %5,1). Gerçek hasarla (EMSR648) Kahramanmaraş'ta katı kuralda fark tam olarak sıfırdır (hiç Destroyed kesim yok); orta/gevşek kuralda 44,4 dakikaya çıkmaktadır. Dördüncüsü görev tabanlı değerlendirmedir (Bölüm 4.7): bugünkü SegFormer kapanmalarıyla planlama, üç drone sahnesinde sınanan sert kullanımın 15 ayarının hiçbirinde kapanma bilgisi olmayan ajandan daha iyi sonuç vermemiştir.</w:t>
       </w:r>
     </w:p>
     <w:p>
@@ -36525,7 +36520,7 @@
         <w:t>Yer seviyesi tespit başarımı ve bölgeler arası genelleme bu sürümde ölçülmemiş, kapanma katmanının yer gerçeğine göre değerlendirilmesi yalnızca SegFormer için ve kesim düzeyinde yapılabilmiştir;</w:t>
       </w:r>
       <w:r>
-        <w:t xml:space="preserve"> ilgili tablolar iskelet hâlinde bırakılmış ve hiçbir hücre kestirimle doldurulmamıştır. Çok mimarili bölütleme kıyaslaması, metin sınıflandırma ve risk skorlaması ölçülmüş; ancak üçü de hedef protokolden ayrılan koşullarda üretildiği için (bölütlemede yol yerine bina hasarı görevi ve sabitlenemeyen kodlayıcı, metinde beş üst kategori yerine çok etiketli alt kategori kümesi, risk skorlamasında artçı ayıklaması yapılmamış katalog) nihai değerler değil ön bulgular olarak sunulmaktadır. </w:t>
+        <w:t xml:space="preserve"> ilgili tablolar iskelet hâlinde bırakılmış ve hiçbir hücre kestirimle doldurulmamıştır. Çok mimarili bölütleme kıyaslaması, metin sınıflandırma ve risk skorlaması ölçülmüş; ancak üçü de hedef protokolden ayrılan koşullarda üretildiği için (bölütlemede yol yerine bina hasarı görevi ve sabitlenemeyen kodlayıcı, metinde beş üst kategori yerine çok etiketli alt kategori kümesi, risk skorlamasında sabit/kısa pencereli basit bir kümelenmeden arındırma yöntemi) nihai değerler değil ön bulgular olarak sunulmaktadır. </w:t>
       </w:r>
       <w:r>
         <w:rPr>
@@ -36578,6 +36573,20 @@
         <w:pStyle w:val="Balk1"/>
       </w:pPr>
       <w:r>
+        <w:t>FİNANSMAN</w:t>
+      </w:r>
+    </w:p>
+    <w:p>
+      <w:pPr/>
+      <w:r>
+        <w:t>Bu çalışma, TÜBİTAK 2209-A Üniversite Öğrencileri Araştırma Projeleri Destekleme Programı kapsamında 1919B012547445 başvuru numaralı proje ile desteklenmiştir.</w:t>
+      </w:r>
+    </w:p>
+    <w:p>
+      <w:pPr>
+        <w:pStyle w:val="Balk1"/>
+      </w:pPr>
+      <w:r>
         <w:rPr>
           <w:rFonts w:ascii="Times New Roman" w:hAnsi="Times New Roman"/>
           <w:b w:val="0"/>
@@ -36586,17 +36595,14 @@
       </w:r>
     </w:p>
     <w:p>
-      <w:r>
-        <w:t xml:space="preserve">Bu çalışma, TÜBİTAK 2209-A Üniversite Öğrencileri Araştırma Projeleri Destekleme Programı kapsamında </w:t>
-      </w:r>
+      <w:r/>
       <w:r>
         <w:rPr>
           <w:highlight w:val="yellow"/>
         </w:rPr>
-        <w:t>1919B012547445 başvuru numaralı proje ile desteklenmiştir.</w:t>
-      </w:r>
-      <w:r>
-        <w:t xml:space="preserve"> Yazarlar, EMSR648 aktivasyonu kapsamındaki hasar derecelendirme haritalarını açık erişime sunan Copernicus Acil Durum Yönetimi Servisi'ne, Open Data Programı ile afet sonrası görüntüleri erişilebilir kılan Maxar Technologies'e ve yol ağı verisini sağlayan OpenStreetMap katkıcılarına teşekkür eder.</w:t>
+      </w:r>
+      <w:r>
+        <w:t>Yazarlar, EMSR648 aktivasyonu kapsamındaki hasar derecelendirme haritalarını açık erişime sunan Copernicus Acil Durum Yönetimi Servisi'ne, Open Data Programı ile afet sonrası görüntüleri erişilebilir kılan Maxar Technologies'e ve yol ağı verisini sağlayan OpenStreetMap katkıcılarına teşekkür eder.</w:t>
       </w:r>
       <w:r>
         <w:rPr>

</xml_diff>